<commit_message>
Add new documents for Sprint 5: Backlog, Test Report, and Planned vs. Actual
</commit_message>
<xml_diff>
--- a/Documentos Base/Sprint 5 documentacion/Sprint_05_Planificado_Realizado_ICARO.docx
+++ b/Documentos Base/Sprint 5 documentacion/Sprint_05_Planificado_Realizado_ICARO.docx
@@ -58,13 +58,8 @@
         <w:pStyle w:val="Ttulo1"/>
       </w:pPr>
       <w:r>
-        <w:t xml:space="preserve">1. Control </w:t>
+        <w:t>1. Control documental</w:t>
       </w:r>
-      <w:proofErr w:type="gramStart"/>
-      <w:r>
-        <w:t>documental</w:t>
-      </w:r>
-      <w:proofErr w:type="gramEnd"/>
     </w:p>
     <w:tbl>
       <w:tblPr>
@@ -93,17 +88,8 @@
                 <w:b/>
                 <w:szCs w:val="28"/>
               </w:rPr>
-              <w:t xml:space="preserve">Código del </w:t>
-            </w:r>
-            <w:proofErr w:type="spellStart"/>
-            <w:r>
-              <w:rPr>
-                <w:b/>
-                <w:szCs w:val="28"/>
-              </w:rPr>
-              <w:t>documento</w:t>
-            </w:r>
-            <w:proofErr w:type="spellEnd"/>
+              <w:t>Código del documento</w:t>
+            </w:r>
           </w:p>
         </w:tc>
         <w:tc>
@@ -179,7 +165,6 @@
                 <w:szCs w:val="28"/>
               </w:rPr>
             </w:pPr>
-            <w:proofErr w:type="spellStart"/>
             <w:r>
               <w:rPr>
                 <w:b/>
@@ -187,7 +172,6 @@
               </w:rPr>
               <w:t>Versión</w:t>
             </w:r>
-            <w:proofErr w:type="spellEnd"/>
           </w:p>
         </w:tc>
         <w:tc>
@@ -244,7 +228,19 @@
               <w:rPr>
                 <w:szCs w:val="28"/>
               </w:rPr>
-              <w:t>13/05/2026</w:t>
+              <w:t>1</w:t>
+            </w:r>
+            <w:r>
+              <w:rPr>
+                <w:szCs w:val="28"/>
+              </w:rPr>
+              <w:t>6</w:t>
+            </w:r>
+            <w:r>
+              <w:rPr>
+                <w:szCs w:val="28"/>
+              </w:rPr>
+              <w:t>/05/2026</w:t>
             </w:r>
           </w:p>
         </w:tc>
@@ -303,31 +299,13 @@
                 <w:szCs w:val="28"/>
               </w:rPr>
             </w:pPr>
-            <w:proofErr w:type="spellStart"/>
             <w:r>
               <w:rPr>
                 <w:b/>
                 <w:szCs w:val="28"/>
               </w:rPr>
-              <w:t>Responsable</w:t>
-            </w:r>
-            <w:proofErr w:type="spellEnd"/>
-            <w:r>
-              <w:rPr>
-                <w:b/>
-                <w:szCs w:val="28"/>
-              </w:rPr>
-              <w:t xml:space="preserve"> de </w:t>
-            </w:r>
-            <w:proofErr w:type="spellStart"/>
-            <w:r>
-              <w:rPr>
-                <w:b/>
-                <w:szCs w:val="28"/>
-              </w:rPr>
-              <w:t>elaboración</w:t>
-            </w:r>
-            <w:proofErr w:type="spellEnd"/>
+              <w:t>Responsable de elaboración</w:t>
+            </w:r>
           </w:p>
         </w:tc>
         <w:tc>
@@ -524,7 +502,19 @@
               <w:rPr>
                 <w:szCs w:val="28"/>
               </w:rPr>
-              <w:t>13/05/2026</w:t>
+              <w:t>1</w:t>
+            </w:r>
+            <w:r>
+              <w:rPr>
+                <w:szCs w:val="28"/>
+              </w:rPr>
+              <w:t>6</w:t>
+            </w:r>
+            <w:r>
+              <w:rPr>
+                <w:szCs w:val="28"/>
+              </w:rPr>
+              <w:t>/05/2026</w:t>
             </w:r>
           </w:p>
         </w:tc>
@@ -575,15 +565,7 @@
         <w:pStyle w:val="Ttulo1"/>
       </w:pPr>
       <w:r>
-        <w:t xml:space="preserve">2. Datos </w:t>
-      </w:r>
-      <w:proofErr w:type="spellStart"/>
-      <w:r>
-        <w:t>generales</w:t>
-      </w:r>
-      <w:proofErr w:type="spellEnd"/>
-      <w:r>
-        <w:t xml:space="preserve"> del sprint</w:t>
+        <w:t>2. Datos generales del sprint</w:t>
       </w:r>
     </w:p>
     <w:tbl>
@@ -700,18 +682,71 @@
                 <w:color w:val="000000"/>
                 <w:szCs w:val="28"/>
               </w:rPr>
-              <w:t xml:space="preserve">Fecha de </w:t>
-            </w:r>
-            <w:proofErr w:type="spellStart"/>
+              <w:t>Fecha de inicio</w:t>
+            </w:r>
+          </w:p>
+        </w:tc>
+        <w:tc>
+          <w:tcPr>
+            <w:tcW w:w="4320" w:type="dxa"/>
+          </w:tcPr>
+          <w:p>
+            <w:pPr>
+              <w:rPr>
+                <w:szCs w:val="28"/>
+              </w:rPr>
+            </w:pPr>
+            <w:r>
+              <w:rPr>
+                <w:color w:val="000000"/>
+                <w:szCs w:val="28"/>
+              </w:rPr>
+              <w:t>11</w:t>
+            </w:r>
+            <w:r>
+              <w:rPr>
+                <w:color w:val="000000"/>
+                <w:szCs w:val="28"/>
+              </w:rPr>
+              <w:t>/0</w:t>
+            </w:r>
+            <w:r>
+              <w:rPr>
+                <w:color w:val="000000"/>
+                <w:szCs w:val="28"/>
+              </w:rPr>
+              <w:t>5</w:t>
+            </w:r>
+            <w:r>
+              <w:rPr>
+                <w:color w:val="000000"/>
+                <w:szCs w:val="28"/>
+              </w:rPr>
+              <w:t>/2026</w:t>
+            </w:r>
+          </w:p>
+        </w:tc>
+      </w:tr>
+      <w:tr>
+        <w:tc>
+          <w:tcPr>
+            <w:tcW w:w="4320" w:type="dxa"/>
+            <w:shd w:val="clear" w:color="auto" w:fill="D9E1F2"/>
+          </w:tcPr>
+          <w:p>
+            <w:pPr>
+              <w:rPr>
+                <w:szCs w:val="28"/>
+              </w:rPr>
+            </w:pPr>
             <w:r>
               <w:rPr>
                 <w:b/>
                 <w:color w:val="000000"/>
                 <w:szCs w:val="28"/>
               </w:rPr>
-              <w:t>inicio</w:t>
-            </w:r>
-            <w:proofErr w:type="spellEnd"/>
+              <w:t>Fecha de cierre</w:t>
+            </w:r>
           </w:p>
         </w:tc>
         <w:tc>
@@ -729,70 +764,7 @@
                 <w:color w:val="000000"/>
                 <w:szCs w:val="28"/>
               </w:rPr>
-              <w:t>04</w:t>
-            </w:r>
-            <w:r>
-              <w:rPr>
-                <w:color w:val="000000"/>
-                <w:szCs w:val="28"/>
-              </w:rPr>
-              <w:t>/0</w:t>
-            </w:r>
-            <w:r>
-              <w:rPr>
-                <w:color w:val="000000"/>
-                <w:szCs w:val="28"/>
-              </w:rPr>
-              <w:t>5</w:t>
-            </w:r>
-            <w:r>
-              <w:rPr>
-                <w:color w:val="000000"/>
-                <w:szCs w:val="28"/>
-              </w:rPr>
-              <w:t>/2026</w:t>
-            </w:r>
-          </w:p>
-        </w:tc>
-      </w:tr>
-      <w:tr>
-        <w:tc>
-          <w:tcPr>
-            <w:tcW w:w="4320" w:type="dxa"/>
-            <w:shd w:val="clear" w:color="auto" w:fill="D9E1F2"/>
-          </w:tcPr>
-          <w:p>
-            <w:pPr>
-              <w:rPr>
-                <w:szCs w:val="28"/>
-              </w:rPr>
-            </w:pPr>
-            <w:r>
-              <w:rPr>
-                <w:b/>
-                <w:color w:val="000000"/>
-                <w:szCs w:val="28"/>
-              </w:rPr>
-              <w:t>Fecha de cierre</w:t>
-            </w:r>
-          </w:p>
-        </w:tc>
-        <w:tc>
-          <w:tcPr>
-            <w:tcW w:w="4320" w:type="dxa"/>
-          </w:tcPr>
-          <w:p>
-            <w:pPr>
-              <w:rPr>
-                <w:szCs w:val="28"/>
-              </w:rPr>
-            </w:pPr>
-            <w:r>
-              <w:rPr>
-                <w:color w:val="000000"/>
-                <w:szCs w:val="28"/>
-              </w:rPr>
-              <w:t>08</w:t>
+              <w:t>15</w:t>
             </w:r>
             <w:r>
               <w:rPr>
@@ -910,62 +882,47 @@
         <w:pStyle w:val="Ttulo1"/>
       </w:pPr>
       <w:r>
-        <w:t xml:space="preserve">3. </w:t>
-      </w:r>
-      <w:proofErr w:type="spellStart"/>
-      <w:r>
-        <w:t>Historias</w:t>
-      </w:r>
-      <w:proofErr w:type="spellEnd"/>
-      <w:r>
-        <w:t>/</w:t>
-      </w:r>
-      <w:proofErr w:type="spellStart"/>
-      <w:r>
-        <w:t>Tareas</w:t>
-      </w:r>
-      <w:proofErr w:type="spellEnd"/>
-      <w:r>
-        <w:t xml:space="preserve">: </w:t>
-      </w:r>
-      <w:proofErr w:type="spellStart"/>
-      <w:r>
-        <w:t>Planificado</w:t>
-      </w:r>
-      <w:proofErr w:type="spellEnd"/>
-      <w:r>
-        <w:t xml:space="preserve"> vs. Realizado</w:t>
+        <w:t>3. Historias/Tareas: Planificado vs. Realizado</w:t>
       </w:r>
     </w:p>
     <w:tbl>
       <w:tblPr>
         <w:tblStyle w:val="Tablaconcuadrcula"/>
         <w:tblW w:w="0" w:type="auto"/>
+        <w:tblLayout w:type="fixed"/>
         <w:tblLook w:val="04A0" w:firstRow="1" w:lastRow="0" w:firstColumn="1" w:lastColumn="0" w:noHBand="0" w:noVBand="1"/>
       </w:tblPr>
       <w:tblGrid>
-        <w:gridCol w:w="940"/>
-        <w:gridCol w:w="1323"/>
-        <w:gridCol w:w="576"/>
-        <w:gridCol w:w="1326"/>
-        <w:gridCol w:w="566"/>
-        <w:gridCol w:w="561"/>
-        <w:gridCol w:w="969"/>
-        <w:gridCol w:w="779"/>
-        <w:gridCol w:w="1090"/>
-        <w:gridCol w:w="726"/>
+        <w:gridCol w:w="534"/>
+        <w:gridCol w:w="1417"/>
+        <w:gridCol w:w="567"/>
+        <w:gridCol w:w="1024"/>
+        <w:gridCol w:w="677"/>
+        <w:gridCol w:w="709"/>
+        <w:gridCol w:w="992"/>
+        <w:gridCol w:w="851"/>
+        <w:gridCol w:w="1134"/>
+        <w:gridCol w:w="951"/>
       </w:tblGrid>
       <w:tr>
         <w:tc>
           <w:tcPr>
-            <w:tcW w:w="864" w:type="dxa"/>
+            <w:tcW w:w="534" w:type="dxa"/>
             <w:shd w:val="clear" w:color="auto" w:fill="1F3864"/>
           </w:tcPr>
           <w:p>
+            <w:pPr>
+              <w:rPr>
+                <w:sz w:val="16"/>
+                <w:szCs w:val="16"/>
+              </w:rPr>
+            </w:pPr>
             <w:r>
               <w:rPr>
                 <w:b/>
                 <w:color w:val="FFFFFF"/>
+                <w:sz w:val="16"/>
+                <w:szCs w:val="16"/>
               </w:rPr>
               <w:t>ID</w:t>
             </w:r>
@@ -973,14 +930,22 @@
         </w:tc>
         <w:tc>
           <w:tcPr>
-            <w:tcW w:w="864" w:type="dxa"/>
+            <w:tcW w:w="1417" w:type="dxa"/>
             <w:shd w:val="clear" w:color="auto" w:fill="1F3864"/>
           </w:tcPr>
           <w:p>
+            <w:pPr>
+              <w:rPr>
+                <w:sz w:val="16"/>
+                <w:szCs w:val="16"/>
+              </w:rPr>
+            </w:pPr>
             <w:r>
               <w:rPr>
                 <w:b/>
                 <w:color w:val="FFFFFF"/>
+                <w:sz w:val="16"/>
+                <w:szCs w:val="16"/>
               </w:rPr>
               <w:t>Historia / Tarea</w:t>
             </w:r>
@@ -988,14 +953,22 @@
         </w:tc>
         <w:tc>
           <w:tcPr>
-            <w:tcW w:w="864" w:type="dxa"/>
+            <w:tcW w:w="567" w:type="dxa"/>
             <w:shd w:val="clear" w:color="auto" w:fill="1F3864"/>
           </w:tcPr>
           <w:p>
+            <w:pPr>
+              <w:rPr>
+                <w:sz w:val="16"/>
+                <w:szCs w:val="16"/>
+              </w:rPr>
+            </w:pPr>
             <w:r>
               <w:rPr>
                 <w:b/>
                 <w:color w:val="FFFFFF"/>
+                <w:sz w:val="16"/>
+                <w:szCs w:val="16"/>
               </w:rPr>
               <w:t>Tipo</w:t>
             </w:r>
@@ -1003,14 +976,22 @@
         </w:tc>
         <w:tc>
           <w:tcPr>
-            <w:tcW w:w="864" w:type="dxa"/>
+            <w:tcW w:w="1024" w:type="dxa"/>
             <w:shd w:val="clear" w:color="auto" w:fill="1F3864"/>
           </w:tcPr>
           <w:p>
+            <w:pPr>
+              <w:rPr>
+                <w:sz w:val="16"/>
+                <w:szCs w:val="16"/>
+              </w:rPr>
+            </w:pPr>
             <w:r>
               <w:rPr>
                 <w:b/>
                 <w:color w:val="FFFFFF"/>
+                <w:sz w:val="16"/>
+                <w:szCs w:val="16"/>
               </w:rPr>
               <w:t>Módulo</w:t>
             </w:r>
@@ -1018,14 +999,22 @@
         </w:tc>
         <w:tc>
           <w:tcPr>
-            <w:tcW w:w="864" w:type="dxa"/>
+            <w:tcW w:w="677" w:type="dxa"/>
             <w:shd w:val="clear" w:color="auto" w:fill="1F3864"/>
           </w:tcPr>
           <w:p>
+            <w:pPr>
+              <w:rPr>
+                <w:sz w:val="16"/>
+                <w:szCs w:val="16"/>
+              </w:rPr>
+            </w:pPr>
             <w:r>
               <w:rPr>
                 <w:b/>
                 <w:color w:val="FFFFFF"/>
+                <w:sz w:val="16"/>
+                <w:szCs w:val="16"/>
               </w:rPr>
               <w:t>SP</w:t>
             </w:r>
@@ -1033,6 +1022,8 @@
               <w:rPr>
                 <w:b/>
                 <w:color w:val="FFFFFF"/>
+                <w:sz w:val="16"/>
+                <w:szCs w:val="16"/>
               </w:rPr>
               <w:br/>
               <w:t>Plan</w:t>
@@ -1041,14 +1032,22 @@
         </w:tc>
         <w:tc>
           <w:tcPr>
-            <w:tcW w:w="864" w:type="dxa"/>
+            <w:tcW w:w="709" w:type="dxa"/>
             <w:shd w:val="clear" w:color="auto" w:fill="1F3864"/>
           </w:tcPr>
           <w:p>
+            <w:pPr>
+              <w:rPr>
+                <w:sz w:val="16"/>
+                <w:szCs w:val="16"/>
+              </w:rPr>
+            </w:pPr>
             <w:r>
               <w:rPr>
                 <w:b/>
                 <w:color w:val="FFFFFF"/>
+                <w:sz w:val="16"/>
+                <w:szCs w:val="16"/>
               </w:rPr>
               <w:t>SP</w:t>
             </w:r>
@@ -1056,6 +1055,8 @@
               <w:rPr>
                 <w:b/>
                 <w:color w:val="FFFFFF"/>
+                <w:sz w:val="16"/>
+                <w:szCs w:val="16"/>
               </w:rPr>
               <w:br/>
               <w:t>Real</w:t>
@@ -1064,14 +1065,22 @@
         </w:tc>
         <w:tc>
           <w:tcPr>
-            <w:tcW w:w="864" w:type="dxa"/>
+            <w:tcW w:w="992" w:type="dxa"/>
             <w:shd w:val="clear" w:color="auto" w:fill="1F3864"/>
           </w:tcPr>
           <w:p>
+            <w:pPr>
+              <w:rPr>
+                <w:sz w:val="16"/>
+                <w:szCs w:val="16"/>
+              </w:rPr>
+            </w:pPr>
             <w:r>
               <w:rPr>
                 <w:b/>
                 <w:color w:val="FFFFFF"/>
+                <w:sz w:val="16"/>
+                <w:szCs w:val="16"/>
               </w:rPr>
               <w:t>Variación</w:t>
             </w:r>
@@ -1079,14 +1088,22 @@
         </w:tc>
         <w:tc>
           <w:tcPr>
-            <w:tcW w:w="864" w:type="dxa"/>
+            <w:tcW w:w="851" w:type="dxa"/>
             <w:shd w:val="clear" w:color="auto" w:fill="1F3864"/>
           </w:tcPr>
           <w:p>
+            <w:pPr>
+              <w:rPr>
+                <w:sz w:val="16"/>
+                <w:szCs w:val="16"/>
+              </w:rPr>
+            </w:pPr>
             <w:r>
               <w:rPr>
                 <w:b/>
                 <w:color w:val="FFFFFF"/>
+                <w:sz w:val="16"/>
+                <w:szCs w:val="16"/>
               </w:rPr>
               <w:t>% Avance</w:t>
             </w:r>
@@ -1094,14 +1111,22 @@
         </w:tc>
         <w:tc>
           <w:tcPr>
-            <w:tcW w:w="864" w:type="dxa"/>
+            <w:tcW w:w="1134" w:type="dxa"/>
             <w:shd w:val="clear" w:color="auto" w:fill="1F3864"/>
           </w:tcPr>
           <w:p>
+            <w:pPr>
+              <w:rPr>
+                <w:sz w:val="16"/>
+                <w:szCs w:val="16"/>
+              </w:rPr>
+            </w:pPr>
             <w:r>
               <w:rPr>
                 <w:b/>
                 <w:color w:val="FFFFFF"/>
+                <w:sz w:val="16"/>
+                <w:szCs w:val="16"/>
               </w:rPr>
               <w:t>Estado</w:t>
             </w:r>
@@ -1109,14 +1134,22 @@
         </w:tc>
         <w:tc>
           <w:tcPr>
-            <w:tcW w:w="864" w:type="dxa"/>
+            <w:tcW w:w="951" w:type="dxa"/>
             <w:shd w:val="clear" w:color="auto" w:fill="1F3864"/>
           </w:tcPr>
           <w:p>
+            <w:pPr>
+              <w:rPr>
+                <w:sz w:val="16"/>
+                <w:szCs w:val="16"/>
+              </w:rPr>
+            </w:pPr>
             <w:r>
               <w:rPr>
                 <w:b/>
                 <w:color w:val="FFFFFF"/>
+                <w:sz w:val="16"/>
+                <w:szCs w:val="16"/>
               </w:rPr>
               <w:t>Causa de</w:t>
             </w:r>
@@ -1124,6 +1157,8 @@
               <w:rPr>
                 <w:b/>
                 <w:color w:val="FFFFFF"/>
+                <w:sz w:val="16"/>
+                <w:szCs w:val="16"/>
               </w:rPr>
               <w:br/>
               <w:t>desvío</w:t>
@@ -1134,13 +1169,21 @@
       <w:tr>
         <w:tc>
           <w:tcPr>
-            <w:tcW w:w="864" w:type="dxa"/>
+            <w:tcW w:w="534" w:type="dxa"/>
             <w:shd w:val="clear" w:color="auto" w:fill="D9E1F2"/>
           </w:tcPr>
           <w:p>
+            <w:pPr>
+              <w:rPr>
+                <w:sz w:val="16"/>
+                <w:szCs w:val="16"/>
+              </w:rPr>
+            </w:pPr>
             <w:r>
               <w:rPr>
                 <w:color w:val="000000"/>
+                <w:sz w:val="16"/>
+                <w:szCs w:val="16"/>
               </w:rPr>
               <w:t>HU-16</w:t>
             </w:r>
@@ -1148,18 +1191,22 @@
         </w:tc>
         <w:tc>
           <w:tcPr>
-            <w:tcW w:w="864" w:type="dxa"/>
+            <w:tcW w:w="1417" w:type="dxa"/>
             <w:shd w:val="clear" w:color="auto" w:fill="FFFFFF"/>
           </w:tcPr>
           <w:p>
             <w:pPr>
               <w:rPr>
+                <w:sz w:val="16"/>
+                <w:szCs w:val="16"/>
                 <w:lang w:val="es-EC"/>
               </w:rPr>
             </w:pPr>
             <w:r>
               <w:rPr>
                 <w:color w:val="000000"/>
+                <w:sz w:val="16"/>
+                <w:szCs w:val="16"/>
                 <w:lang w:val="es-EC"/>
               </w:rPr>
               <w:t>Generar planilla mensual de obra en PDF con detalle de avances y horas-hombre</w:t>
@@ -1168,13 +1215,21 @@
         </w:tc>
         <w:tc>
           <w:tcPr>
-            <w:tcW w:w="864" w:type="dxa"/>
+            <w:tcW w:w="567" w:type="dxa"/>
             <w:shd w:val="clear" w:color="auto" w:fill="D9E1F2"/>
           </w:tcPr>
           <w:p>
+            <w:pPr>
+              <w:rPr>
+                <w:sz w:val="16"/>
+                <w:szCs w:val="16"/>
+              </w:rPr>
+            </w:pPr>
             <w:r>
               <w:rPr>
                 <w:color w:val="000000"/>
+                <w:sz w:val="16"/>
+                <w:szCs w:val="16"/>
               </w:rPr>
               <w:t>HU</w:t>
             </w:r>
@@ -1182,13 +1237,21 @@
         </w:tc>
         <w:tc>
           <w:tcPr>
-            <w:tcW w:w="864" w:type="dxa"/>
+            <w:tcW w:w="1024" w:type="dxa"/>
             <w:shd w:val="clear" w:color="auto" w:fill="FFFFFF"/>
           </w:tcPr>
           <w:p>
+            <w:pPr>
+              <w:rPr>
+                <w:sz w:val="16"/>
+                <w:szCs w:val="16"/>
+              </w:rPr>
+            </w:pPr>
             <w:r>
               <w:rPr>
                 <w:color w:val="000000"/>
+                <w:sz w:val="16"/>
+                <w:szCs w:val="16"/>
               </w:rPr>
               <w:t>Planilla</w:t>
             </w:r>
@@ -1196,13 +1259,21 @@
         </w:tc>
         <w:tc>
           <w:tcPr>
-            <w:tcW w:w="864" w:type="dxa"/>
+            <w:tcW w:w="677" w:type="dxa"/>
             <w:shd w:val="clear" w:color="auto" w:fill="D9E1F2"/>
           </w:tcPr>
           <w:p>
+            <w:pPr>
+              <w:rPr>
+                <w:sz w:val="16"/>
+                <w:szCs w:val="16"/>
+              </w:rPr>
+            </w:pPr>
             <w:r>
               <w:rPr>
                 <w:color w:val="000000"/>
+                <w:sz w:val="16"/>
+                <w:szCs w:val="16"/>
               </w:rPr>
               <w:t>5</w:t>
             </w:r>
@@ -1210,13 +1281,21 @@
         </w:tc>
         <w:tc>
           <w:tcPr>
-            <w:tcW w:w="864" w:type="dxa"/>
+            <w:tcW w:w="709" w:type="dxa"/>
             <w:shd w:val="clear" w:color="auto" w:fill="FFFFFF"/>
           </w:tcPr>
           <w:p>
+            <w:pPr>
+              <w:rPr>
+                <w:sz w:val="16"/>
+                <w:szCs w:val="16"/>
+              </w:rPr>
+            </w:pPr>
             <w:r>
               <w:rPr>
                 <w:color w:val="000000"/>
+                <w:sz w:val="16"/>
+                <w:szCs w:val="16"/>
               </w:rPr>
               <w:t>5</w:t>
             </w:r>
@@ -1224,13 +1303,21 @@
         </w:tc>
         <w:tc>
           <w:tcPr>
-            <w:tcW w:w="864" w:type="dxa"/>
+            <w:tcW w:w="992" w:type="dxa"/>
             <w:shd w:val="clear" w:color="auto" w:fill="D9E1F2"/>
           </w:tcPr>
           <w:p>
+            <w:pPr>
+              <w:rPr>
+                <w:sz w:val="16"/>
+                <w:szCs w:val="16"/>
+              </w:rPr>
+            </w:pPr>
             <w:r>
               <w:rPr>
                 <w:color w:val="000000"/>
+                <w:sz w:val="16"/>
+                <w:szCs w:val="16"/>
               </w:rPr>
               <w:t>0</w:t>
             </w:r>
@@ -1238,13 +1325,21 @@
         </w:tc>
         <w:tc>
           <w:tcPr>
-            <w:tcW w:w="864" w:type="dxa"/>
+            <w:tcW w:w="851" w:type="dxa"/>
             <w:shd w:val="clear" w:color="auto" w:fill="FFFFFF"/>
           </w:tcPr>
           <w:p>
+            <w:pPr>
+              <w:rPr>
+                <w:sz w:val="16"/>
+                <w:szCs w:val="16"/>
+              </w:rPr>
+            </w:pPr>
             <w:r>
               <w:rPr>
                 <w:color w:val="000000"/>
+                <w:sz w:val="16"/>
+                <w:szCs w:val="16"/>
               </w:rPr>
               <w:t>100%</w:t>
             </w:r>
@@ -1252,13 +1347,21 @@
         </w:tc>
         <w:tc>
           <w:tcPr>
-            <w:tcW w:w="864" w:type="dxa"/>
+            <w:tcW w:w="1134" w:type="dxa"/>
             <w:shd w:val="clear" w:color="auto" w:fill="E2EFDA"/>
           </w:tcPr>
           <w:p>
+            <w:pPr>
+              <w:rPr>
+                <w:sz w:val="16"/>
+                <w:szCs w:val="16"/>
+              </w:rPr>
+            </w:pPr>
             <w:r>
               <w:rPr>
                 <w:color w:val="000000"/>
+                <w:sz w:val="16"/>
+                <w:szCs w:val="16"/>
               </w:rPr>
               <w:t>Completado</w:t>
             </w:r>
@@ -1266,13 +1369,21 @@
         </w:tc>
         <w:tc>
           <w:tcPr>
-            <w:tcW w:w="864" w:type="dxa"/>
+            <w:tcW w:w="951" w:type="dxa"/>
             <w:shd w:val="clear" w:color="auto" w:fill="FFFFFF"/>
           </w:tcPr>
           <w:p>
+            <w:pPr>
+              <w:rPr>
+                <w:sz w:val="16"/>
+                <w:szCs w:val="16"/>
+              </w:rPr>
+            </w:pPr>
             <w:r>
               <w:rPr>
                 <w:color w:val="000000"/>
+                <w:sz w:val="16"/>
+                <w:szCs w:val="16"/>
               </w:rPr>
               <w:t>Sin desvío</w:t>
             </w:r>
@@ -1282,13 +1393,21 @@
       <w:tr>
         <w:tc>
           <w:tcPr>
-            <w:tcW w:w="864" w:type="dxa"/>
+            <w:tcW w:w="534" w:type="dxa"/>
             <w:shd w:val="clear" w:color="auto" w:fill="D9E1F2"/>
           </w:tcPr>
           <w:p>
+            <w:pPr>
+              <w:rPr>
+                <w:sz w:val="16"/>
+                <w:szCs w:val="16"/>
+              </w:rPr>
+            </w:pPr>
             <w:r>
               <w:rPr>
                 <w:color w:val="000000"/>
+                <w:sz w:val="16"/>
+                <w:szCs w:val="16"/>
               </w:rPr>
               <w:t>HU-17</w:t>
             </w:r>
@@ -1296,41 +1415,513 @@
         </w:tc>
         <w:tc>
           <w:tcPr>
-            <w:tcW w:w="864" w:type="dxa"/>
+            <w:tcW w:w="1417" w:type="dxa"/>
             <w:shd w:val="clear" w:color="auto" w:fill="FFFFFF"/>
           </w:tcPr>
           <w:p>
             <w:pPr>
               <w:rPr>
+                <w:sz w:val="16"/>
+                <w:szCs w:val="16"/>
                 <w:lang w:val="es-EC"/>
               </w:rPr>
             </w:pPr>
             <w:r>
               <w:rPr>
                 <w:color w:val="000000"/>
+                <w:sz w:val="16"/>
+                <w:szCs w:val="16"/>
                 <w:lang w:val="es-EC"/>
               </w:rPr>
-              <w:t xml:space="preserve">Ejecutar cierre contable </w:t>
-            </w:r>
+              <w:t>Ejecutar cierre contable mensual (consolidar gastos, avances y materiales por proyecto)</w:t>
+            </w:r>
+          </w:p>
+        </w:tc>
+        <w:tc>
+          <w:tcPr>
+            <w:tcW w:w="567" w:type="dxa"/>
+            <w:shd w:val="clear" w:color="auto" w:fill="D9E1F2"/>
+          </w:tcPr>
+          <w:p>
+            <w:pPr>
+              <w:rPr>
+                <w:sz w:val="16"/>
+                <w:szCs w:val="16"/>
+              </w:rPr>
+            </w:pPr>
             <w:r>
               <w:rPr>
                 <w:color w:val="000000"/>
+                <w:sz w:val="16"/>
+                <w:szCs w:val="16"/>
+              </w:rPr>
+              <w:t>HU</w:t>
+            </w:r>
+          </w:p>
+        </w:tc>
+        <w:tc>
+          <w:tcPr>
+            <w:tcW w:w="1024" w:type="dxa"/>
+            <w:shd w:val="clear" w:color="auto" w:fill="FFFFFF"/>
+          </w:tcPr>
+          <w:p>
+            <w:pPr>
+              <w:rPr>
+                <w:sz w:val="16"/>
+                <w:szCs w:val="16"/>
+              </w:rPr>
+            </w:pPr>
+            <w:r>
+              <w:rPr>
+                <w:color w:val="000000"/>
+                <w:sz w:val="16"/>
+                <w:szCs w:val="16"/>
+              </w:rPr>
+              <w:t>Contabilidad</w:t>
+            </w:r>
+          </w:p>
+        </w:tc>
+        <w:tc>
+          <w:tcPr>
+            <w:tcW w:w="677" w:type="dxa"/>
+            <w:shd w:val="clear" w:color="auto" w:fill="D9E1F2"/>
+          </w:tcPr>
+          <w:p>
+            <w:pPr>
+              <w:rPr>
+                <w:sz w:val="16"/>
+                <w:szCs w:val="16"/>
+              </w:rPr>
+            </w:pPr>
+            <w:r>
+              <w:rPr>
+                <w:color w:val="000000"/>
+                <w:sz w:val="16"/>
+                <w:szCs w:val="16"/>
+              </w:rPr>
+              <w:t>5</w:t>
+            </w:r>
+          </w:p>
+        </w:tc>
+        <w:tc>
+          <w:tcPr>
+            <w:tcW w:w="709" w:type="dxa"/>
+            <w:shd w:val="clear" w:color="auto" w:fill="FFFFFF"/>
+          </w:tcPr>
+          <w:p>
+            <w:pPr>
+              <w:rPr>
+                <w:sz w:val="16"/>
+                <w:szCs w:val="16"/>
+              </w:rPr>
+            </w:pPr>
+            <w:r>
+              <w:rPr>
+                <w:color w:val="000000"/>
+                <w:sz w:val="16"/>
+                <w:szCs w:val="16"/>
+              </w:rPr>
+              <w:t>5</w:t>
+            </w:r>
+          </w:p>
+        </w:tc>
+        <w:tc>
+          <w:tcPr>
+            <w:tcW w:w="992" w:type="dxa"/>
+            <w:shd w:val="clear" w:color="auto" w:fill="D9E1F2"/>
+          </w:tcPr>
+          <w:p>
+            <w:pPr>
+              <w:rPr>
+                <w:sz w:val="16"/>
+                <w:szCs w:val="16"/>
+              </w:rPr>
+            </w:pPr>
+            <w:r>
+              <w:rPr>
+                <w:color w:val="000000"/>
+                <w:sz w:val="16"/>
+                <w:szCs w:val="16"/>
+              </w:rPr>
+              <w:t>0</w:t>
+            </w:r>
+          </w:p>
+        </w:tc>
+        <w:tc>
+          <w:tcPr>
+            <w:tcW w:w="851" w:type="dxa"/>
+            <w:shd w:val="clear" w:color="auto" w:fill="FFFFFF"/>
+          </w:tcPr>
+          <w:p>
+            <w:pPr>
+              <w:rPr>
+                <w:sz w:val="16"/>
+                <w:szCs w:val="16"/>
+              </w:rPr>
+            </w:pPr>
+            <w:r>
+              <w:rPr>
+                <w:color w:val="000000"/>
+                <w:sz w:val="16"/>
+                <w:szCs w:val="16"/>
+              </w:rPr>
+              <w:t>100%</w:t>
+            </w:r>
+          </w:p>
+        </w:tc>
+        <w:tc>
+          <w:tcPr>
+            <w:tcW w:w="1134" w:type="dxa"/>
+            <w:shd w:val="clear" w:color="auto" w:fill="E2EFDA"/>
+          </w:tcPr>
+          <w:p>
+            <w:pPr>
+              <w:rPr>
+                <w:sz w:val="16"/>
+                <w:szCs w:val="16"/>
+              </w:rPr>
+            </w:pPr>
+            <w:r>
+              <w:rPr>
+                <w:color w:val="000000"/>
+                <w:sz w:val="16"/>
+                <w:szCs w:val="16"/>
+              </w:rPr>
+              <w:t>Completado</w:t>
+            </w:r>
+          </w:p>
+        </w:tc>
+        <w:tc>
+          <w:tcPr>
+            <w:tcW w:w="951" w:type="dxa"/>
+            <w:shd w:val="clear" w:color="auto" w:fill="FFFFFF"/>
+          </w:tcPr>
+          <w:p>
+            <w:pPr>
+              <w:rPr>
+                <w:sz w:val="16"/>
+                <w:szCs w:val="16"/>
+              </w:rPr>
+            </w:pPr>
+            <w:r>
+              <w:rPr>
+                <w:color w:val="000000"/>
+                <w:sz w:val="16"/>
+                <w:szCs w:val="16"/>
+              </w:rPr>
+              <w:t>Sin desvío</w:t>
+            </w:r>
+          </w:p>
+        </w:tc>
+      </w:tr>
+      <w:tr>
+        <w:tc>
+          <w:tcPr>
+            <w:tcW w:w="534" w:type="dxa"/>
+            <w:shd w:val="clear" w:color="auto" w:fill="D9E1F2"/>
+          </w:tcPr>
+          <w:p>
+            <w:pPr>
+              <w:rPr>
+                <w:sz w:val="16"/>
+                <w:szCs w:val="16"/>
+              </w:rPr>
+            </w:pPr>
+            <w:r>
+              <w:rPr>
+                <w:color w:val="000000"/>
+                <w:sz w:val="16"/>
+                <w:szCs w:val="16"/>
+              </w:rPr>
+              <w:t>HU-18</w:t>
+            </w:r>
+          </w:p>
+        </w:tc>
+        <w:tc>
+          <w:tcPr>
+            <w:tcW w:w="1417" w:type="dxa"/>
+            <w:shd w:val="clear" w:color="auto" w:fill="FFFFFF"/>
+          </w:tcPr>
+          <w:p>
+            <w:pPr>
+              <w:rPr>
+                <w:sz w:val="16"/>
+                <w:szCs w:val="16"/>
                 <w:lang w:val="es-EC"/>
               </w:rPr>
+            </w:pPr>
+            <w:r>
+              <w:rPr>
+                <w:color w:val="000000"/>
+                <w:sz w:val="16"/>
+                <w:szCs w:val="16"/>
+                <w:lang w:val="es-EC"/>
+              </w:rPr>
+              <w:t>Consultar historial de planillas mensuales generadas por proyecto con filtro de periodo</w:t>
+            </w:r>
+          </w:p>
+        </w:tc>
+        <w:tc>
+          <w:tcPr>
+            <w:tcW w:w="567" w:type="dxa"/>
+            <w:shd w:val="clear" w:color="auto" w:fill="D9E1F2"/>
+          </w:tcPr>
+          <w:p>
+            <w:pPr>
+              <w:rPr>
+                <w:sz w:val="16"/>
+                <w:szCs w:val="16"/>
+              </w:rPr>
+            </w:pPr>
+            <w:r>
+              <w:rPr>
+                <w:color w:val="000000"/>
+                <w:sz w:val="16"/>
+                <w:szCs w:val="16"/>
+              </w:rPr>
+              <w:t>HU</w:t>
+            </w:r>
+          </w:p>
+        </w:tc>
+        <w:tc>
+          <w:tcPr>
+            <w:tcW w:w="1024" w:type="dxa"/>
+            <w:shd w:val="clear" w:color="auto" w:fill="FFFFFF"/>
+          </w:tcPr>
+          <w:p>
+            <w:pPr>
+              <w:rPr>
+                <w:sz w:val="16"/>
+                <w:szCs w:val="16"/>
+              </w:rPr>
+            </w:pPr>
+            <w:r>
+              <w:rPr>
+                <w:color w:val="000000"/>
+                <w:sz w:val="16"/>
+                <w:szCs w:val="16"/>
+              </w:rPr>
+              <w:t>Planilla</w:t>
+            </w:r>
+          </w:p>
+        </w:tc>
+        <w:tc>
+          <w:tcPr>
+            <w:tcW w:w="677" w:type="dxa"/>
+            <w:shd w:val="clear" w:color="auto" w:fill="D9E1F2"/>
+          </w:tcPr>
+          <w:p>
+            <w:pPr>
+              <w:rPr>
+                <w:sz w:val="16"/>
+                <w:szCs w:val="16"/>
+              </w:rPr>
+            </w:pPr>
+            <w:r>
+              <w:rPr>
+                <w:color w:val="000000"/>
+                <w:sz w:val="16"/>
+                <w:szCs w:val="16"/>
+              </w:rPr>
+              <w:t>3</w:t>
+            </w:r>
+          </w:p>
+        </w:tc>
+        <w:tc>
+          <w:tcPr>
+            <w:tcW w:w="709" w:type="dxa"/>
+            <w:shd w:val="clear" w:color="auto" w:fill="FFFFFF"/>
+          </w:tcPr>
+          <w:p>
+            <w:pPr>
+              <w:rPr>
+                <w:sz w:val="16"/>
+                <w:szCs w:val="16"/>
+              </w:rPr>
+            </w:pPr>
+            <w:r>
+              <w:rPr>
+                <w:color w:val="000000"/>
+                <w:sz w:val="16"/>
+                <w:szCs w:val="16"/>
+              </w:rPr>
+              <w:t>3</w:t>
+            </w:r>
+          </w:p>
+        </w:tc>
+        <w:tc>
+          <w:tcPr>
+            <w:tcW w:w="992" w:type="dxa"/>
+            <w:shd w:val="clear" w:color="auto" w:fill="D9E1F2"/>
+          </w:tcPr>
+          <w:p>
+            <w:pPr>
+              <w:rPr>
+                <w:sz w:val="16"/>
+                <w:szCs w:val="16"/>
+              </w:rPr>
+            </w:pPr>
+            <w:r>
+              <w:rPr>
+                <w:color w:val="000000"/>
+                <w:sz w:val="16"/>
+                <w:szCs w:val="16"/>
+              </w:rPr>
+              <w:t>0</w:t>
+            </w:r>
+          </w:p>
+        </w:tc>
+        <w:tc>
+          <w:tcPr>
+            <w:tcW w:w="851" w:type="dxa"/>
+            <w:shd w:val="clear" w:color="auto" w:fill="FFFFFF"/>
+          </w:tcPr>
+          <w:p>
+            <w:pPr>
+              <w:rPr>
+                <w:sz w:val="16"/>
+                <w:szCs w:val="16"/>
+              </w:rPr>
+            </w:pPr>
+            <w:r>
+              <w:rPr>
+                <w:color w:val="000000"/>
+                <w:sz w:val="16"/>
+                <w:szCs w:val="16"/>
+              </w:rPr>
+              <w:t>100%</w:t>
+            </w:r>
+          </w:p>
+        </w:tc>
+        <w:tc>
+          <w:tcPr>
+            <w:tcW w:w="1134" w:type="dxa"/>
+            <w:shd w:val="clear" w:color="auto" w:fill="E2EFDA"/>
+          </w:tcPr>
+          <w:p>
+            <w:pPr>
+              <w:rPr>
+                <w:sz w:val="16"/>
+                <w:szCs w:val="16"/>
+              </w:rPr>
+            </w:pPr>
+            <w:r>
+              <w:rPr>
+                <w:color w:val="000000"/>
+                <w:sz w:val="16"/>
+                <w:szCs w:val="16"/>
+              </w:rPr>
+              <w:t>Completado</w:t>
+            </w:r>
+          </w:p>
+        </w:tc>
+        <w:tc>
+          <w:tcPr>
+            <w:tcW w:w="951" w:type="dxa"/>
+            <w:shd w:val="clear" w:color="auto" w:fill="FFFFFF"/>
+          </w:tcPr>
+          <w:p>
+            <w:pPr>
+              <w:rPr>
+                <w:sz w:val="16"/>
+                <w:szCs w:val="16"/>
+              </w:rPr>
+            </w:pPr>
+            <w:r>
+              <w:rPr>
+                <w:color w:val="000000"/>
+                <w:sz w:val="16"/>
+                <w:szCs w:val="16"/>
+              </w:rPr>
+              <w:t>Sin desvío</w:t>
+            </w:r>
+          </w:p>
+        </w:tc>
+      </w:tr>
+      <w:tr>
+        <w:tc>
+          <w:tcPr>
+            <w:tcW w:w="534" w:type="dxa"/>
+            <w:shd w:val="clear" w:color="auto" w:fill="D9E1F2"/>
+          </w:tcPr>
+          <w:p>
+            <w:pPr>
+              <w:rPr>
+                <w:sz w:val="16"/>
+                <w:szCs w:val="16"/>
+              </w:rPr>
+            </w:pPr>
+            <w:r>
+              <w:rPr>
+                <w:color w:val="000000"/>
+                <w:sz w:val="16"/>
+                <w:szCs w:val="16"/>
+              </w:rPr>
+              <w:t>HU-</w:t>
+            </w:r>
+            <w:r>
+              <w:rPr>
+                <w:color w:val="000000"/>
+                <w:sz w:val="16"/>
+                <w:szCs w:val="16"/>
+              </w:rPr>
               <w:lastRenderedPageBreak/>
-              <w:t>mensual (consolidar gastos, avances y materiales por proyecto)</w:t>
-            </w:r>
-          </w:p>
-        </w:tc>
-        <w:tc>
-          <w:tcPr>
-            <w:tcW w:w="864" w:type="dxa"/>
+              <w:t>19</w:t>
+            </w:r>
+          </w:p>
+        </w:tc>
+        <w:tc>
+          <w:tcPr>
+            <w:tcW w:w="1417" w:type="dxa"/>
+            <w:shd w:val="clear" w:color="auto" w:fill="FFFFFF"/>
+          </w:tcPr>
+          <w:p>
+            <w:pPr>
+              <w:rPr>
+                <w:sz w:val="16"/>
+                <w:szCs w:val="16"/>
+                <w:lang w:val="es-EC"/>
+              </w:rPr>
+            </w:pPr>
+            <w:r>
+              <w:rPr>
+                <w:color w:val="000000"/>
+                <w:sz w:val="16"/>
+                <w:szCs w:val="16"/>
+                <w:lang w:val="es-EC"/>
+              </w:rPr>
+              <w:lastRenderedPageBreak/>
+              <w:t xml:space="preserve">Registrar y listar </w:t>
+            </w:r>
+            <w:r>
+              <w:rPr>
+                <w:color w:val="000000"/>
+                <w:sz w:val="16"/>
+                <w:szCs w:val="16"/>
+                <w:lang w:val="es-EC"/>
+              </w:rPr>
+              <w:lastRenderedPageBreak/>
+              <w:t>gastos operativos del cierre contable con detalle de rubros</w:t>
+            </w:r>
+          </w:p>
+        </w:tc>
+        <w:tc>
+          <w:tcPr>
+            <w:tcW w:w="567" w:type="dxa"/>
             <w:shd w:val="clear" w:color="auto" w:fill="D9E1F2"/>
           </w:tcPr>
           <w:p>
+            <w:pPr>
+              <w:rPr>
+                <w:sz w:val="16"/>
+                <w:szCs w:val="16"/>
+              </w:rPr>
+            </w:pPr>
             <w:r>
               <w:rPr>
                 <w:color w:val="000000"/>
+                <w:sz w:val="16"/>
+                <w:szCs w:val="16"/>
               </w:rPr>
               <w:lastRenderedPageBreak/>
               <w:t>HU</w:t>
@@ -1339,55 +1930,97 @@
         </w:tc>
         <w:tc>
           <w:tcPr>
-            <w:tcW w:w="864" w:type="dxa"/>
+            <w:tcW w:w="1024" w:type="dxa"/>
             <w:shd w:val="clear" w:color="auto" w:fill="FFFFFF"/>
           </w:tcPr>
           <w:p>
+            <w:pPr>
+              <w:rPr>
+                <w:sz w:val="16"/>
+                <w:szCs w:val="16"/>
+              </w:rPr>
+            </w:pPr>
             <w:r>
               <w:rPr>
                 <w:color w:val="000000"/>
-              </w:rPr>
-              <w:t>Contabilidad</w:t>
-            </w:r>
-          </w:p>
-        </w:tc>
-        <w:tc>
-          <w:tcPr>
-            <w:tcW w:w="864" w:type="dxa"/>
+                <w:sz w:val="16"/>
+                <w:szCs w:val="16"/>
+              </w:rPr>
+              <w:t>Contabilida</w:t>
+            </w:r>
+            <w:r>
+              <w:rPr>
+                <w:color w:val="000000"/>
+                <w:sz w:val="16"/>
+                <w:szCs w:val="16"/>
+              </w:rPr>
+              <w:lastRenderedPageBreak/>
+              <w:t>d</w:t>
+            </w:r>
+          </w:p>
+        </w:tc>
+        <w:tc>
+          <w:tcPr>
+            <w:tcW w:w="677" w:type="dxa"/>
             <w:shd w:val="clear" w:color="auto" w:fill="D9E1F2"/>
           </w:tcPr>
           <w:p>
+            <w:pPr>
+              <w:rPr>
+                <w:sz w:val="16"/>
+                <w:szCs w:val="16"/>
+              </w:rPr>
+            </w:pPr>
             <w:r>
               <w:rPr>
                 <w:color w:val="000000"/>
-              </w:rPr>
-              <w:t>5</w:t>
-            </w:r>
-          </w:p>
-        </w:tc>
-        <w:tc>
-          <w:tcPr>
-            <w:tcW w:w="864" w:type="dxa"/>
+                <w:sz w:val="16"/>
+                <w:szCs w:val="16"/>
+              </w:rPr>
+              <w:lastRenderedPageBreak/>
+              <w:t>3</w:t>
+            </w:r>
+          </w:p>
+        </w:tc>
+        <w:tc>
+          <w:tcPr>
+            <w:tcW w:w="709" w:type="dxa"/>
             <w:shd w:val="clear" w:color="auto" w:fill="FFFFFF"/>
           </w:tcPr>
           <w:p>
+            <w:pPr>
+              <w:rPr>
+                <w:sz w:val="16"/>
+                <w:szCs w:val="16"/>
+              </w:rPr>
+            </w:pPr>
             <w:r>
               <w:rPr>
                 <w:color w:val="000000"/>
-              </w:rPr>
-              <w:t>5</w:t>
-            </w:r>
-          </w:p>
-        </w:tc>
-        <w:tc>
-          <w:tcPr>
-            <w:tcW w:w="864" w:type="dxa"/>
+                <w:sz w:val="16"/>
+                <w:szCs w:val="16"/>
+              </w:rPr>
+              <w:t>3</w:t>
+            </w:r>
+          </w:p>
+        </w:tc>
+        <w:tc>
+          <w:tcPr>
+            <w:tcW w:w="992" w:type="dxa"/>
             <w:shd w:val="clear" w:color="auto" w:fill="D9E1F2"/>
           </w:tcPr>
           <w:p>
+            <w:pPr>
+              <w:rPr>
+                <w:sz w:val="16"/>
+                <w:szCs w:val="16"/>
+              </w:rPr>
+            </w:pPr>
             <w:r>
               <w:rPr>
                 <w:color w:val="000000"/>
+                <w:sz w:val="16"/>
+                <w:szCs w:val="16"/>
               </w:rPr>
               <w:t>0</w:t>
             </w:r>
@@ -1395,13 +2028,21 @@
         </w:tc>
         <w:tc>
           <w:tcPr>
-            <w:tcW w:w="864" w:type="dxa"/>
+            <w:tcW w:w="851" w:type="dxa"/>
             <w:shd w:val="clear" w:color="auto" w:fill="FFFFFF"/>
           </w:tcPr>
           <w:p>
+            <w:pPr>
+              <w:rPr>
+                <w:sz w:val="16"/>
+                <w:szCs w:val="16"/>
+              </w:rPr>
+            </w:pPr>
             <w:r>
               <w:rPr>
                 <w:color w:val="000000"/>
+                <w:sz w:val="16"/>
+                <w:szCs w:val="16"/>
               </w:rPr>
               <w:t>100%</w:t>
             </w:r>
@@ -1409,13 +2050,21 @@
         </w:tc>
         <w:tc>
           <w:tcPr>
-            <w:tcW w:w="864" w:type="dxa"/>
+            <w:tcW w:w="1134" w:type="dxa"/>
             <w:shd w:val="clear" w:color="auto" w:fill="E2EFDA"/>
           </w:tcPr>
           <w:p>
+            <w:pPr>
+              <w:rPr>
+                <w:sz w:val="16"/>
+                <w:szCs w:val="16"/>
+              </w:rPr>
+            </w:pPr>
             <w:r>
               <w:rPr>
                 <w:color w:val="000000"/>
+                <w:sz w:val="16"/>
+                <w:szCs w:val="16"/>
               </w:rPr>
               <w:t>Completado</w:t>
             </w:r>
@@ -1423,13 +2072,21 @@
         </w:tc>
         <w:tc>
           <w:tcPr>
-            <w:tcW w:w="864" w:type="dxa"/>
+            <w:tcW w:w="951" w:type="dxa"/>
             <w:shd w:val="clear" w:color="auto" w:fill="FFFFFF"/>
           </w:tcPr>
           <w:p>
+            <w:pPr>
+              <w:rPr>
+                <w:sz w:val="16"/>
+                <w:szCs w:val="16"/>
+              </w:rPr>
+            </w:pPr>
             <w:r>
               <w:rPr>
                 <w:color w:val="000000"/>
+                <w:sz w:val="16"/>
+                <w:szCs w:val="16"/>
               </w:rPr>
               <w:t>Sin desvío</w:t>
             </w:r>
@@ -1439,75 +2096,111 @@
       <w:tr>
         <w:tc>
           <w:tcPr>
-            <w:tcW w:w="864" w:type="dxa"/>
+            <w:tcW w:w="534" w:type="dxa"/>
             <w:shd w:val="clear" w:color="auto" w:fill="D9E1F2"/>
           </w:tcPr>
           <w:p>
+            <w:pPr>
+              <w:rPr>
+                <w:sz w:val="16"/>
+                <w:szCs w:val="16"/>
+              </w:rPr>
+            </w:pPr>
             <w:r>
               <w:rPr>
                 <w:color w:val="000000"/>
-              </w:rPr>
-              <w:t>HU-18</w:t>
-            </w:r>
-          </w:p>
-        </w:tc>
-        <w:tc>
-          <w:tcPr>
-            <w:tcW w:w="864" w:type="dxa"/>
+                <w:sz w:val="16"/>
+                <w:szCs w:val="16"/>
+              </w:rPr>
+              <w:t>HT-11</w:t>
+            </w:r>
+          </w:p>
+        </w:tc>
+        <w:tc>
+          <w:tcPr>
+            <w:tcW w:w="1417" w:type="dxa"/>
             <w:shd w:val="clear" w:color="auto" w:fill="FFFFFF"/>
           </w:tcPr>
           <w:p>
             <w:pPr>
               <w:rPr>
+                <w:sz w:val="16"/>
+                <w:szCs w:val="16"/>
                 <w:lang w:val="es-EC"/>
               </w:rPr>
             </w:pPr>
             <w:r>
               <w:rPr>
                 <w:color w:val="000000"/>
+                <w:sz w:val="16"/>
+                <w:szCs w:val="16"/>
                 <w:lang w:val="es-EC"/>
               </w:rPr>
-              <w:t>Consultar historial de planillas mensuales generadas por proyecto con filtro de periodo</w:t>
-            </w:r>
-          </w:p>
-        </w:tc>
-        <w:tc>
-          <w:tcPr>
-            <w:tcW w:w="864" w:type="dxa"/>
+              <w:t>Integrar librería PDFKit para generación de planillas mensuales en backend</w:t>
+            </w:r>
+          </w:p>
+        </w:tc>
+        <w:tc>
+          <w:tcPr>
+            <w:tcW w:w="567" w:type="dxa"/>
             <w:shd w:val="clear" w:color="auto" w:fill="D9E1F2"/>
           </w:tcPr>
           <w:p>
+            <w:pPr>
+              <w:rPr>
+                <w:sz w:val="16"/>
+                <w:szCs w:val="16"/>
+              </w:rPr>
+            </w:pPr>
             <w:r>
               <w:rPr>
                 <w:color w:val="000000"/>
-              </w:rPr>
-              <w:t>HU</w:t>
-            </w:r>
-          </w:p>
-        </w:tc>
-        <w:tc>
-          <w:tcPr>
-            <w:tcW w:w="864" w:type="dxa"/>
+                <w:sz w:val="16"/>
+                <w:szCs w:val="16"/>
+              </w:rPr>
+              <w:t>HT</w:t>
+            </w:r>
+          </w:p>
+        </w:tc>
+        <w:tc>
+          <w:tcPr>
+            <w:tcW w:w="1024" w:type="dxa"/>
             <w:shd w:val="clear" w:color="auto" w:fill="FFFFFF"/>
           </w:tcPr>
           <w:p>
+            <w:pPr>
+              <w:rPr>
+                <w:sz w:val="16"/>
+                <w:szCs w:val="16"/>
+              </w:rPr>
+            </w:pPr>
             <w:r>
               <w:rPr>
                 <w:color w:val="000000"/>
-              </w:rPr>
-              <w:t>Planilla</w:t>
-            </w:r>
-          </w:p>
-        </w:tc>
-        <w:tc>
-          <w:tcPr>
-            <w:tcW w:w="864" w:type="dxa"/>
+                <w:sz w:val="16"/>
+                <w:szCs w:val="16"/>
+              </w:rPr>
+              <w:t>Infraestructura</w:t>
+            </w:r>
+          </w:p>
+        </w:tc>
+        <w:tc>
+          <w:tcPr>
+            <w:tcW w:w="677" w:type="dxa"/>
             <w:shd w:val="clear" w:color="auto" w:fill="D9E1F2"/>
           </w:tcPr>
           <w:p>
+            <w:pPr>
+              <w:rPr>
+                <w:sz w:val="16"/>
+                <w:szCs w:val="16"/>
+              </w:rPr>
+            </w:pPr>
             <w:r>
               <w:rPr>
                 <w:color w:val="000000"/>
+                <w:sz w:val="16"/>
+                <w:szCs w:val="16"/>
               </w:rPr>
               <w:t>3</w:t>
             </w:r>
@@ -1515,13 +2208,21 @@
         </w:tc>
         <w:tc>
           <w:tcPr>
-            <w:tcW w:w="864" w:type="dxa"/>
+            <w:tcW w:w="709" w:type="dxa"/>
             <w:shd w:val="clear" w:color="auto" w:fill="FFFFFF"/>
           </w:tcPr>
           <w:p>
+            <w:pPr>
+              <w:rPr>
+                <w:sz w:val="16"/>
+                <w:szCs w:val="16"/>
+              </w:rPr>
+            </w:pPr>
             <w:r>
               <w:rPr>
                 <w:color w:val="000000"/>
+                <w:sz w:val="16"/>
+                <w:szCs w:val="16"/>
               </w:rPr>
               <w:t>3</w:t>
             </w:r>
@@ -1529,13 +2230,21 @@
         </w:tc>
         <w:tc>
           <w:tcPr>
-            <w:tcW w:w="864" w:type="dxa"/>
+            <w:tcW w:w="992" w:type="dxa"/>
             <w:shd w:val="clear" w:color="auto" w:fill="D9E1F2"/>
           </w:tcPr>
           <w:p>
+            <w:pPr>
+              <w:rPr>
+                <w:sz w:val="16"/>
+                <w:szCs w:val="16"/>
+              </w:rPr>
+            </w:pPr>
             <w:r>
               <w:rPr>
                 <w:color w:val="000000"/>
+                <w:sz w:val="16"/>
+                <w:szCs w:val="16"/>
               </w:rPr>
               <w:t>0</w:t>
             </w:r>
@@ -1543,13 +2252,21 @@
         </w:tc>
         <w:tc>
           <w:tcPr>
-            <w:tcW w:w="864" w:type="dxa"/>
+            <w:tcW w:w="851" w:type="dxa"/>
             <w:shd w:val="clear" w:color="auto" w:fill="FFFFFF"/>
           </w:tcPr>
           <w:p>
+            <w:pPr>
+              <w:rPr>
+                <w:sz w:val="16"/>
+                <w:szCs w:val="16"/>
+              </w:rPr>
+            </w:pPr>
             <w:r>
               <w:rPr>
                 <w:color w:val="000000"/>
+                <w:sz w:val="16"/>
+                <w:szCs w:val="16"/>
               </w:rPr>
               <w:t>100%</w:t>
             </w:r>
@@ -1557,13 +2274,21 @@
         </w:tc>
         <w:tc>
           <w:tcPr>
-            <w:tcW w:w="864" w:type="dxa"/>
+            <w:tcW w:w="1134" w:type="dxa"/>
             <w:shd w:val="clear" w:color="auto" w:fill="E2EFDA"/>
           </w:tcPr>
           <w:p>
+            <w:pPr>
+              <w:rPr>
+                <w:sz w:val="16"/>
+                <w:szCs w:val="16"/>
+              </w:rPr>
+            </w:pPr>
             <w:r>
               <w:rPr>
                 <w:color w:val="000000"/>
+                <w:sz w:val="16"/>
+                <w:szCs w:val="16"/>
               </w:rPr>
               <w:t>Completado</w:t>
             </w:r>
@@ -1571,13 +2296,21 @@
         </w:tc>
         <w:tc>
           <w:tcPr>
-            <w:tcW w:w="864" w:type="dxa"/>
+            <w:tcW w:w="951" w:type="dxa"/>
             <w:shd w:val="clear" w:color="auto" w:fill="FFFFFF"/>
           </w:tcPr>
           <w:p>
+            <w:pPr>
+              <w:rPr>
+                <w:sz w:val="16"/>
+                <w:szCs w:val="16"/>
+              </w:rPr>
+            </w:pPr>
             <w:r>
               <w:rPr>
                 <w:color w:val="000000"/>
+                <w:sz w:val="16"/>
+                <w:szCs w:val="16"/>
               </w:rPr>
               <w:t>Sin desvío</w:t>
             </w:r>
@@ -1587,75 +2320,111 @@
       <w:tr>
         <w:tc>
           <w:tcPr>
-            <w:tcW w:w="864" w:type="dxa"/>
+            <w:tcW w:w="534" w:type="dxa"/>
             <w:shd w:val="clear" w:color="auto" w:fill="D9E1F2"/>
           </w:tcPr>
           <w:p>
+            <w:pPr>
+              <w:rPr>
+                <w:sz w:val="16"/>
+                <w:szCs w:val="16"/>
+              </w:rPr>
+            </w:pPr>
             <w:r>
               <w:rPr>
                 <w:color w:val="000000"/>
-              </w:rPr>
-              <w:t>HU-19</w:t>
-            </w:r>
-          </w:p>
-        </w:tc>
-        <w:tc>
-          <w:tcPr>
-            <w:tcW w:w="864" w:type="dxa"/>
+                <w:sz w:val="16"/>
+                <w:szCs w:val="16"/>
+              </w:rPr>
+              <w:t>HT-12</w:t>
+            </w:r>
+          </w:p>
+        </w:tc>
+        <w:tc>
+          <w:tcPr>
+            <w:tcW w:w="1417" w:type="dxa"/>
             <w:shd w:val="clear" w:color="auto" w:fill="FFFFFF"/>
           </w:tcPr>
           <w:p>
             <w:pPr>
               <w:rPr>
+                <w:sz w:val="16"/>
+                <w:szCs w:val="16"/>
                 <w:lang w:val="es-EC"/>
               </w:rPr>
             </w:pPr>
             <w:r>
               <w:rPr>
                 <w:color w:val="000000"/>
+                <w:sz w:val="16"/>
+                <w:szCs w:val="16"/>
                 <w:lang w:val="es-EC"/>
               </w:rPr>
-              <w:t>Registrar y listar gastos operativos del cierre contable con detalle de rubros</w:t>
-            </w:r>
-          </w:p>
-        </w:tc>
-        <w:tc>
-          <w:tcPr>
-            <w:tcW w:w="864" w:type="dxa"/>
+              <w:t>Suite de pruebas automatizadas: planilla mensual y cierre contable</w:t>
+            </w:r>
+          </w:p>
+        </w:tc>
+        <w:tc>
+          <w:tcPr>
+            <w:tcW w:w="567" w:type="dxa"/>
             <w:shd w:val="clear" w:color="auto" w:fill="D9E1F2"/>
           </w:tcPr>
           <w:p>
+            <w:pPr>
+              <w:rPr>
+                <w:sz w:val="16"/>
+                <w:szCs w:val="16"/>
+              </w:rPr>
+            </w:pPr>
             <w:r>
               <w:rPr>
                 <w:color w:val="000000"/>
-              </w:rPr>
-              <w:t>HU</w:t>
-            </w:r>
-          </w:p>
-        </w:tc>
-        <w:tc>
-          <w:tcPr>
-            <w:tcW w:w="864" w:type="dxa"/>
+                <w:sz w:val="16"/>
+                <w:szCs w:val="16"/>
+              </w:rPr>
+              <w:t>HT</w:t>
+            </w:r>
+          </w:p>
+        </w:tc>
+        <w:tc>
+          <w:tcPr>
+            <w:tcW w:w="1024" w:type="dxa"/>
             <w:shd w:val="clear" w:color="auto" w:fill="FFFFFF"/>
           </w:tcPr>
           <w:p>
+            <w:pPr>
+              <w:rPr>
+                <w:sz w:val="16"/>
+                <w:szCs w:val="16"/>
+              </w:rPr>
+            </w:pPr>
             <w:r>
               <w:rPr>
                 <w:color w:val="000000"/>
-              </w:rPr>
-              <w:t>Contabilidad</w:t>
-            </w:r>
-          </w:p>
-        </w:tc>
-        <w:tc>
-          <w:tcPr>
-            <w:tcW w:w="864" w:type="dxa"/>
+                <w:sz w:val="16"/>
+                <w:szCs w:val="16"/>
+              </w:rPr>
+              <w:t>Calidad</w:t>
+            </w:r>
+          </w:p>
+        </w:tc>
+        <w:tc>
+          <w:tcPr>
+            <w:tcW w:w="677" w:type="dxa"/>
             <w:shd w:val="clear" w:color="auto" w:fill="D9E1F2"/>
           </w:tcPr>
           <w:p>
+            <w:pPr>
+              <w:rPr>
+                <w:sz w:val="16"/>
+                <w:szCs w:val="16"/>
+              </w:rPr>
+            </w:pPr>
             <w:r>
               <w:rPr>
                 <w:color w:val="000000"/>
+                <w:sz w:val="16"/>
+                <w:szCs w:val="16"/>
               </w:rPr>
               <w:t>3</w:t>
             </w:r>
@@ -1663,13 +2432,21 @@
         </w:tc>
         <w:tc>
           <w:tcPr>
-            <w:tcW w:w="864" w:type="dxa"/>
+            <w:tcW w:w="709" w:type="dxa"/>
             <w:shd w:val="clear" w:color="auto" w:fill="FFFFFF"/>
           </w:tcPr>
           <w:p>
+            <w:pPr>
+              <w:rPr>
+                <w:sz w:val="16"/>
+                <w:szCs w:val="16"/>
+              </w:rPr>
+            </w:pPr>
             <w:r>
               <w:rPr>
                 <w:color w:val="000000"/>
+                <w:sz w:val="16"/>
+                <w:szCs w:val="16"/>
               </w:rPr>
               <w:t>3</w:t>
             </w:r>
@@ -1677,13 +2454,21 @@
         </w:tc>
         <w:tc>
           <w:tcPr>
-            <w:tcW w:w="864" w:type="dxa"/>
+            <w:tcW w:w="992" w:type="dxa"/>
             <w:shd w:val="clear" w:color="auto" w:fill="D9E1F2"/>
           </w:tcPr>
           <w:p>
+            <w:pPr>
+              <w:rPr>
+                <w:sz w:val="16"/>
+                <w:szCs w:val="16"/>
+              </w:rPr>
+            </w:pPr>
             <w:r>
               <w:rPr>
                 <w:color w:val="000000"/>
+                <w:sz w:val="16"/>
+                <w:szCs w:val="16"/>
               </w:rPr>
               <w:t>0</w:t>
             </w:r>
@@ -1691,13 +2476,21 @@
         </w:tc>
         <w:tc>
           <w:tcPr>
-            <w:tcW w:w="864" w:type="dxa"/>
+            <w:tcW w:w="851" w:type="dxa"/>
             <w:shd w:val="clear" w:color="auto" w:fill="FFFFFF"/>
           </w:tcPr>
           <w:p>
+            <w:pPr>
+              <w:rPr>
+                <w:sz w:val="16"/>
+                <w:szCs w:val="16"/>
+              </w:rPr>
+            </w:pPr>
             <w:r>
               <w:rPr>
                 <w:color w:val="000000"/>
+                <w:sz w:val="16"/>
+                <w:szCs w:val="16"/>
               </w:rPr>
               <w:t>100%</w:t>
             </w:r>
@@ -1705,13 +2498,21 @@
         </w:tc>
         <w:tc>
           <w:tcPr>
-            <w:tcW w:w="864" w:type="dxa"/>
+            <w:tcW w:w="1134" w:type="dxa"/>
             <w:shd w:val="clear" w:color="auto" w:fill="E2EFDA"/>
           </w:tcPr>
           <w:p>
+            <w:pPr>
+              <w:rPr>
+                <w:sz w:val="16"/>
+                <w:szCs w:val="16"/>
+              </w:rPr>
+            </w:pPr>
             <w:r>
               <w:rPr>
                 <w:color w:val="000000"/>
+                <w:sz w:val="16"/>
+                <w:szCs w:val="16"/>
               </w:rPr>
               <w:t>Completado</w:t>
             </w:r>
@@ -1719,13 +2520,21 @@
         </w:tc>
         <w:tc>
           <w:tcPr>
-            <w:tcW w:w="864" w:type="dxa"/>
+            <w:tcW w:w="951" w:type="dxa"/>
             <w:shd w:val="clear" w:color="auto" w:fill="FFFFFF"/>
           </w:tcPr>
           <w:p>
+            <w:pPr>
+              <w:rPr>
+                <w:sz w:val="16"/>
+                <w:szCs w:val="16"/>
+              </w:rPr>
+            </w:pPr>
             <w:r>
               <w:rPr>
                 <w:color w:val="000000"/>
+                <w:sz w:val="16"/>
+                <w:szCs w:val="16"/>
               </w:rPr>
               <w:t>Sin desvío</w:t>
             </w:r>
@@ -1735,326 +2544,22 @@
       <w:tr>
         <w:tc>
           <w:tcPr>
-            <w:tcW w:w="864" w:type="dxa"/>
-            <w:shd w:val="clear" w:color="auto" w:fill="D9E1F2"/>
-          </w:tcPr>
-          <w:p>
-            <w:r>
-              <w:rPr>
-                <w:color w:val="000000"/>
-              </w:rPr>
-              <w:t>HT-11</w:t>
-            </w:r>
-          </w:p>
-        </w:tc>
-        <w:tc>
-          <w:tcPr>
-            <w:tcW w:w="864" w:type="dxa"/>
-            <w:shd w:val="clear" w:color="auto" w:fill="FFFFFF"/>
-          </w:tcPr>
-          <w:p>
-            <w:pPr>
-              <w:rPr>
-                <w:lang w:val="es-EC"/>
-              </w:rPr>
-            </w:pPr>
-            <w:r>
-              <w:rPr>
-                <w:color w:val="000000"/>
-                <w:lang w:val="es-EC"/>
-              </w:rPr>
-              <w:t xml:space="preserve">Integrar librería </w:t>
-            </w:r>
-            <w:proofErr w:type="spellStart"/>
-            <w:r>
-              <w:rPr>
-                <w:color w:val="000000"/>
-                <w:lang w:val="es-EC"/>
-              </w:rPr>
-              <w:t>PDFKit</w:t>
-            </w:r>
-            <w:proofErr w:type="spellEnd"/>
-            <w:r>
-              <w:rPr>
-                <w:color w:val="000000"/>
-                <w:lang w:val="es-EC"/>
-              </w:rPr>
-              <w:t xml:space="preserve"> para generación de planillas mensuales en backend</w:t>
-            </w:r>
-          </w:p>
-        </w:tc>
-        <w:tc>
-          <w:tcPr>
-            <w:tcW w:w="864" w:type="dxa"/>
-            <w:shd w:val="clear" w:color="auto" w:fill="D9E1F2"/>
-          </w:tcPr>
-          <w:p>
-            <w:r>
-              <w:rPr>
-                <w:color w:val="000000"/>
-              </w:rPr>
-              <w:t>HT</w:t>
-            </w:r>
-          </w:p>
-        </w:tc>
-        <w:tc>
-          <w:tcPr>
-            <w:tcW w:w="864" w:type="dxa"/>
-            <w:shd w:val="clear" w:color="auto" w:fill="FFFFFF"/>
-          </w:tcPr>
-          <w:p>
-            <w:r>
-              <w:rPr>
-                <w:color w:val="000000"/>
-              </w:rPr>
-              <w:t>Infraestructura</w:t>
-            </w:r>
-          </w:p>
-        </w:tc>
-        <w:tc>
-          <w:tcPr>
-            <w:tcW w:w="864" w:type="dxa"/>
-            <w:shd w:val="clear" w:color="auto" w:fill="D9E1F2"/>
-          </w:tcPr>
-          <w:p>
-            <w:r>
-              <w:rPr>
-                <w:color w:val="000000"/>
-              </w:rPr>
-              <w:t>3</w:t>
-            </w:r>
-          </w:p>
-        </w:tc>
-        <w:tc>
-          <w:tcPr>
-            <w:tcW w:w="864" w:type="dxa"/>
-            <w:shd w:val="clear" w:color="auto" w:fill="FFFFFF"/>
-          </w:tcPr>
-          <w:p>
-            <w:r>
-              <w:rPr>
-                <w:color w:val="000000"/>
-              </w:rPr>
-              <w:t>3</w:t>
-            </w:r>
-          </w:p>
-        </w:tc>
-        <w:tc>
-          <w:tcPr>
-            <w:tcW w:w="864" w:type="dxa"/>
-            <w:shd w:val="clear" w:color="auto" w:fill="D9E1F2"/>
-          </w:tcPr>
-          <w:p>
-            <w:r>
-              <w:rPr>
-                <w:color w:val="000000"/>
-              </w:rPr>
-              <w:t>0</w:t>
-            </w:r>
-          </w:p>
-        </w:tc>
-        <w:tc>
-          <w:tcPr>
-            <w:tcW w:w="864" w:type="dxa"/>
-            <w:shd w:val="clear" w:color="auto" w:fill="FFFFFF"/>
-          </w:tcPr>
-          <w:p>
-            <w:r>
-              <w:rPr>
-                <w:color w:val="000000"/>
-              </w:rPr>
-              <w:t>100%</w:t>
-            </w:r>
-          </w:p>
-        </w:tc>
-        <w:tc>
-          <w:tcPr>
-            <w:tcW w:w="864" w:type="dxa"/>
-            <w:shd w:val="clear" w:color="auto" w:fill="E2EFDA"/>
-          </w:tcPr>
-          <w:p>
-            <w:r>
-              <w:rPr>
-                <w:color w:val="000000"/>
-              </w:rPr>
-              <w:t>Completado</w:t>
-            </w:r>
-          </w:p>
-        </w:tc>
-        <w:tc>
-          <w:tcPr>
-            <w:tcW w:w="864" w:type="dxa"/>
-            <w:shd w:val="clear" w:color="auto" w:fill="FFFFFF"/>
-          </w:tcPr>
-          <w:p>
-            <w:r>
-              <w:rPr>
-                <w:color w:val="000000"/>
-              </w:rPr>
-              <w:t>Sin desvío</w:t>
-            </w:r>
-          </w:p>
-        </w:tc>
-      </w:tr>
-      <w:tr>
-        <w:tc>
-          <w:tcPr>
-            <w:tcW w:w="864" w:type="dxa"/>
-            <w:shd w:val="clear" w:color="auto" w:fill="D9E1F2"/>
-          </w:tcPr>
-          <w:p>
-            <w:r>
-              <w:rPr>
-                <w:color w:val="000000"/>
-              </w:rPr>
-              <w:t>HT-12</w:t>
-            </w:r>
-          </w:p>
-        </w:tc>
-        <w:tc>
-          <w:tcPr>
-            <w:tcW w:w="864" w:type="dxa"/>
-            <w:shd w:val="clear" w:color="auto" w:fill="FFFFFF"/>
-          </w:tcPr>
-          <w:p>
-            <w:pPr>
-              <w:rPr>
-                <w:lang w:val="es-EC"/>
-              </w:rPr>
-            </w:pPr>
-            <w:r>
-              <w:rPr>
-                <w:color w:val="000000"/>
-                <w:lang w:val="es-EC"/>
-              </w:rPr>
-              <w:t>Suite de pruebas automatizadas: planilla mensual y cierre contable</w:t>
-            </w:r>
-          </w:p>
-        </w:tc>
-        <w:tc>
-          <w:tcPr>
-            <w:tcW w:w="864" w:type="dxa"/>
-            <w:shd w:val="clear" w:color="auto" w:fill="D9E1F2"/>
-          </w:tcPr>
-          <w:p>
-            <w:r>
-              <w:rPr>
-                <w:color w:val="000000"/>
-              </w:rPr>
-              <w:t>HT</w:t>
-            </w:r>
-          </w:p>
-        </w:tc>
-        <w:tc>
-          <w:tcPr>
-            <w:tcW w:w="864" w:type="dxa"/>
-            <w:shd w:val="clear" w:color="auto" w:fill="FFFFFF"/>
-          </w:tcPr>
-          <w:p>
-            <w:r>
-              <w:rPr>
-                <w:color w:val="000000"/>
-              </w:rPr>
-              <w:t>Calidad</w:t>
-            </w:r>
-          </w:p>
-        </w:tc>
-        <w:tc>
-          <w:tcPr>
-            <w:tcW w:w="864" w:type="dxa"/>
-            <w:shd w:val="clear" w:color="auto" w:fill="D9E1F2"/>
-          </w:tcPr>
-          <w:p>
-            <w:r>
-              <w:rPr>
-                <w:color w:val="000000"/>
-              </w:rPr>
-              <w:t>3</w:t>
-            </w:r>
-          </w:p>
-        </w:tc>
-        <w:tc>
-          <w:tcPr>
-            <w:tcW w:w="864" w:type="dxa"/>
-            <w:shd w:val="clear" w:color="auto" w:fill="FFFFFF"/>
-          </w:tcPr>
-          <w:p>
-            <w:r>
-              <w:rPr>
-                <w:color w:val="000000"/>
-              </w:rPr>
-              <w:t>3</w:t>
-            </w:r>
-          </w:p>
-        </w:tc>
-        <w:tc>
-          <w:tcPr>
-            <w:tcW w:w="864" w:type="dxa"/>
-            <w:shd w:val="clear" w:color="auto" w:fill="D9E1F2"/>
-          </w:tcPr>
-          <w:p>
-            <w:r>
-              <w:rPr>
-                <w:color w:val="000000"/>
-              </w:rPr>
-              <w:t>0</w:t>
-            </w:r>
-          </w:p>
-        </w:tc>
-        <w:tc>
-          <w:tcPr>
-            <w:tcW w:w="864" w:type="dxa"/>
-            <w:shd w:val="clear" w:color="auto" w:fill="FFFFFF"/>
-          </w:tcPr>
-          <w:p>
-            <w:r>
-              <w:rPr>
-                <w:color w:val="000000"/>
-              </w:rPr>
-              <w:t>100%</w:t>
-            </w:r>
-          </w:p>
-        </w:tc>
-        <w:tc>
-          <w:tcPr>
-            <w:tcW w:w="864" w:type="dxa"/>
-            <w:shd w:val="clear" w:color="auto" w:fill="E2EFDA"/>
-          </w:tcPr>
-          <w:p>
-            <w:r>
-              <w:rPr>
-                <w:color w:val="000000"/>
-              </w:rPr>
-              <w:t>Completado</w:t>
-            </w:r>
-          </w:p>
-        </w:tc>
-        <w:tc>
-          <w:tcPr>
-            <w:tcW w:w="864" w:type="dxa"/>
-            <w:shd w:val="clear" w:color="auto" w:fill="FFFFFF"/>
-          </w:tcPr>
-          <w:p>
-            <w:r>
-              <w:rPr>
-                <w:color w:val="000000"/>
-              </w:rPr>
-              <w:t>Sin desvío</w:t>
-            </w:r>
-          </w:p>
-        </w:tc>
-      </w:tr>
-      <w:tr>
-        <w:tc>
-          <w:tcPr>
-            <w:tcW w:w="864" w:type="dxa"/>
+            <w:tcW w:w="534" w:type="dxa"/>
             <w:shd w:val="clear" w:color="auto" w:fill="1F3864"/>
           </w:tcPr>
           <w:p>
+            <w:pPr>
+              <w:rPr>
+                <w:sz w:val="16"/>
+                <w:szCs w:val="16"/>
+              </w:rPr>
+            </w:pPr>
             <w:r>
               <w:rPr>
                 <w:b/>
                 <w:color w:val="FFFFFF"/>
+                <w:sz w:val="16"/>
+                <w:szCs w:val="16"/>
               </w:rPr>
               <w:t>TOTALES</w:t>
             </w:r>
@@ -2062,35 +2567,64 @@
         </w:tc>
         <w:tc>
           <w:tcPr>
-            <w:tcW w:w="864" w:type="dxa"/>
+            <w:tcW w:w="1417" w:type="dxa"/>
             <w:shd w:val="clear" w:color="auto" w:fill="1F3864"/>
           </w:tcPr>
-          <w:p/>
-        </w:tc>
-        <w:tc>
-          <w:tcPr>
-            <w:tcW w:w="864" w:type="dxa"/>
+          <w:p>
+            <w:pPr>
+              <w:rPr>
+                <w:sz w:val="16"/>
+                <w:szCs w:val="16"/>
+              </w:rPr>
+            </w:pPr>
+          </w:p>
+        </w:tc>
+        <w:tc>
+          <w:tcPr>
+            <w:tcW w:w="567" w:type="dxa"/>
             <w:shd w:val="clear" w:color="auto" w:fill="1F3864"/>
           </w:tcPr>
-          <w:p/>
-        </w:tc>
-        <w:tc>
-          <w:tcPr>
-            <w:tcW w:w="864" w:type="dxa"/>
+          <w:p>
+            <w:pPr>
+              <w:rPr>
+                <w:sz w:val="16"/>
+                <w:szCs w:val="16"/>
+              </w:rPr>
+            </w:pPr>
+          </w:p>
+        </w:tc>
+        <w:tc>
+          <w:tcPr>
+            <w:tcW w:w="1024" w:type="dxa"/>
             <w:shd w:val="clear" w:color="auto" w:fill="1F3864"/>
           </w:tcPr>
-          <w:p/>
-        </w:tc>
-        <w:tc>
-          <w:tcPr>
-            <w:tcW w:w="864" w:type="dxa"/>
+          <w:p>
+            <w:pPr>
+              <w:rPr>
+                <w:sz w:val="16"/>
+                <w:szCs w:val="16"/>
+              </w:rPr>
+            </w:pPr>
+          </w:p>
+        </w:tc>
+        <w:tc>
+          <w:tcPr>
+            <w:tcW w:w="677" w:type="dxa"/>
             <w:shd w:val="clear" w:color="auto" w:fill="D9E1F2"/>
           </w:tcPr>
           <w:p>
+            <w:pPr>
+              <w:rPr>
+                <w:sz w:val="16"/>
+                <w:szCs w:val="16"/>
+              </w:rPr>
+            </w:pPr>
             <w:r>
               <w:rPr>
                 <w:b/>
                 <w:color w:val="000000"/>
+                <w:sz w:val="16"/>
+                <w:szCs w:val="16"/>
               </w:rPr>
               <w:t>22</w:t>
             </w:r>
@@ -2098,14 +2632,22 @@
         </w:tc>
         <w:tc>
           <w:tcPr>
-            <w:tcW w:w="864" w:type="dxa"/>
+            <w:tcW w:w="709" w:type="dxa"/>
             <w:shd w:val="clear" w:color="auto" w:fill="D9E1F2"/>
           </w:tcPr>
           <w:p>
+            <w:pPr>
+              <w:rPr>
+                <w:sz w:val="16"/>
+                <w:szCs w:val="16"/>
+              </w:rPr>
+            </w:pPr>
             <w:r>
               <w:rPr>
                 <w:b/>
                 <w:color w:val="000000"/>
+                <w:sz w:val="16"/>
+                <w:szCs w:val="16"/>
               </w:rPr>
               <w:t>22</w:t>
             </w:r>
@@ -2113,14 +2655,22 @@
         </w:tc>
         <w:tc>
           <w:tcPr>
-            <w:tcW w:w="864" w:type="dxa"/>
+            <w:tcW w:w="992" w:type="dxa"/>
             <w:shd w:val="clear" w:color="auto" w:fill="D9E1F2"/>
           </w:tcPr>
           <w:p>
+            <w:pPr>
+              <w:rPr>
+                <w:sz w:val="16"/>
+                <w:szCs w:val="16"/>
+              </w:rPr>
+            </w:pPr>
             <w:r>
               <w:rPr>
                 <w:b/>
                 <w:color w:val="000000"/>
+                <w:sz w:val="16"/>
+                <w:szCs w:val="16"/>
               </w:rPr>
               <w:t>0</w:t>
             </w:r>
@@ -2128,14 +2678,22 @@
         </w:tc>
         <w:tc>
           <w:tcPr>
-            <w:tcW w:w="864" w:type="dxa"/>
+            <w:tcW w:w="851" w:type="dxa"/>
             <w:shd w:val="clear" w:color="auto" w:fill="E2EFDA"/>
           </w:tcPr>
           <w:p>
+            <w:pPr>
+              <w:rPr>
+                <w:sz w:val="16"/>
+                <w:szCs w:val="16"/>
+              </w:rPr>
+            </w:pPr>
             <w:r>
               <w:rPr>
                 <w:b/>
                 <w:color w:val="000000"/>
+                <w:sz w:val="16"/>
+                <w:szCs w:val="16"/>
               </w:rPr>
               <w:t>100%</w:t>
             </w:r>
@@ -2143,17 +2701,31 @@
         </w:tc>
         <w:tc>
           <w:tcPr>
-            <w:tcW w:w="864" w:type="dxa"/>
+            <w:tcW w:w="1134" w:type="dxa"/>
             <w:shd w:val="clear" w:color="auto" w:fill="1F3864"/>
           </w:tcPr>
-          <w:p/>
-        </w:tc>
-        <w:tc>
-          <w:tcPr>
-            <w:tcW w:w="864" w:type="dxa"/>
+          <w:p>
+            <w:pPr>
+              <w:rPr>
+                <w:sz w:val="16"/>
+                <w:szCs w:val="16"/>
+              </w:rPr>
+            </w:pPr>
+          </w:p>
+        </w:tc>
+        <w:tc>
+          <w:tcPr>
+            <w:tcW w:w="951" w:type="dxa"/>
             <w:shd w:val="clear" w:color="auto" w:fill="1F3864"/>
           </w:tcPr>
-          <w:p/>
+          <w:p>
+            <w:pPr>
+              <w:rPr>
+                <w:sz w:val="16"/>
+                <w:szCs w:val="16"/>
+              </w:rPr>
+            </w:pPr>
+          </w:p>
         </w:tc>
       </w:tr>
     </w:tbl>
@@ -2492,7 +3064,6 @@
               <w:rPr>
                 <w:szCs w:val="28"/>
               </w:rPr>
-              <w:lastRenderedPageBreak/>
               <w:t>N° ítems completados</w:t>
             </w:r>
           </w:p>
@@ -2972,25 +3543,7 @@
                 <w:szCs w:val="28"/>
                 <w:lang w:val="es-EC"/>
               </w:rPr>
-              <w:t xml:space="preserve">La integración de </w:t>
-            </w:r>
-            <w:proofErr w:type="spellStart"/>
-            <w:r>
-              <w:rPr>
-                <w:color w:val="000000"/>
-                <w:szCs w:val="28"/>
-                <w:lang w:val="es-EC"/>
-              </w:rPr>
-              <w:t>PDFKit</w:t>
-            </w:r>
-            <w:proofErr w:type="spellEnd"/>
-            <w:r>
-              <w:rPr>
-                <w:color w:val="000000"/>
-                <w:szCs w:val="28"/>
-                <w:lang w:val="es-EC"/>
-              </w:rPr>
-              <w:t xml:space="preserve"> fue más sencilla de lo esperado gracias al patrón de servicios establecido en sprints anteriores. La lógica de consolidación del cierre contable reutilizó el servicio de rubros y materiales ya implementados.</w:t>
+              <w:t>La integración de PDFKit fue más sencilla de lo esperado gracias al patrón de servicios establecido en sprints anteriores. La lógica de consolidación del cierre contable reutilizó el servicio de rubros y materiales ya implementados.</w:t>
             </w:r>
           </w:p>
         </w:tc>
@@ -3007,141 +3560,67 @@
                 <w:szCs w:val="28"/>
               </w:rPr>
             </w:pPr>
-            <w:proofErr w:type="spellStart"/>
             <w:r>
               <w:rPr>
                 <w:b/>
                 <w:color w:val="000000"/>
                 <w:szCs w:val="28"/>
               </w:rPr>
-              <w:t>Factores</w:t>
-            </w:r>
-            <w:proofErr w:type="spellEnd"/>
+              <w:t>Factores que afectaron negativamente</w:t>
+            </w:r>
+          </w:p>
+        </w:tc>
+        <w:tc>
+          <w:tcPr>
+            <w:tcW w:w="4320" w:type="dxa"/>
+          </w:tcPr>
+          <w:p>
+            <w:pPr>
+              <w:rPr>
+                <w:szCs w:val="28"/>
+                <w:lang w:val="es-EC"/>
+              </w:rPr>
+            </w:pPr>
+            <w:r>
+              <w:rPr>
+                <w:color w:val="000000"/>
+                <w:szCs w:val="28"/>
+                <w:lang w:val="es-EC"/>
+              </w:rPr>
+              <w:t xml:space="preserve">La generación del PDF requirió configuración adicional del entorno Docker para incluir las fuentes necesarias. El cálculo de horas-hombre en la planilla mensual requirió ajustes en la consulta de </w:t>
+            </w:r>
+            <w:r>
+              <w:rPr>
+                <w:color w:val="000000"/>
+                <w:szCs w:val="28"/>
+                <w:lang w:val="es-EC"/>
+              </w:rPr>
+              <w:lastRenderedPageBreak/>
+              <w:t>avances.</w:t>
+            </w:r>
+          </w:p>
+        </w:tc>
+      </w:tr>
+      <w:tr>
+        <w:tc>
+          <w:tcPr>
+            <w:tcW w:w="4320" w:type="dxa"/>
+            <w:shd w:val="clear" w:color="auto" w:fill="D9E1F2"/>
+          </w:tcPr>
+          <w:p>
+            <w:pPr>
+              <w:rPr>
+                <w:szCs w:val="28"/>
+              </w:rPr>
+            </w:pPr>
             <w:r>
               <w:rPr>
                 <w:b/>
                 <w:color w:val="000000"/>
                 <w:szCs w:val="28"/>
               </w:rPr>
-              <w:t xml:space="preserve"> </w:t>
-            </w:r>
-            <w:proofErr w:type="spellStart"/>
-            <w:r>
-              <w:rPr>
-                <w:b/>
-                <w:color w:val="000000"/>
-                <w:szCs w:val="28"/>
-              </w:rPr>
-              <w:t>que</w:t>
-            </w:r>
-            <w:proofErr w:type="spellEnd"/>
-            <w:r>
-              <w:rPr>
-                <w:b/>
-                <w:color w:val="000000"/>
-                <w:szCs w:val="28"/>
-              </w:rPr>
-              <w:t xml:space="preserve"> </w:t>
-            </w:r>
-            <w:proofErr w:type="spellStart"/>
-            <w:r>
-              <w:rPr>
-                <w:b/>
-                <w:color w:val="000000"/>
-                <w:szCs w:val="28"/>
-              </w:rPr>
-              <w:t>afectaron</w:t>
-            </w:r>
-            <w:proofErr w:type="spellEnd"/>
-            <w:r>
-              <w:rPr>
-                <w:b/>
-                <w:color w:val="000000"/>
-                <w:szCs w:val="28"/>
-              </w:rPr>
-              <w:t xml:space="preserve"> </w:t>
-            </w:r>
-            <w:proofErr w:type="spellStart"/>
-            <w:r>
-              <w:rPr>
-                <w:b/>
-                <w:color w:val="000000"/>
-                <w:szCs w:val="28"/>
-              </w:rPr>
-              <w:t>negativamente</w:t>
-            </w:r>
-            <w:proofErr w:type="spellEnd"/>
-          </w:p>
-        </w:tc>
-        <w:tc>
-          <w:tcPr>
-            <w:tcW w:w="4320" w:type="dxa"/>
-          </w:tcPr>
-          <w:p>
-            <w:pPr>
-              <w:rPr>
-                <w:szCs w:val="28"/>
-                <w:lang w:val="es-EC"/>
-              </w:rPr>
-            </w:pPr>
-            <w:r>
-              <w:rPr>
-                <w:color w:val="000000"/>
-                <w:szCs w:val="28"/>
-                <w:lang w:val="es-EC"/>
-              </w:rPr>
-              <w:t>La generación del PDF requirió configuración adicional del entorno Docker para incluir las fuentes necesarias. El cálculo de horas-hombre en la planilla mensual requirió ajustes en la consulta de avances.</w:t>
-            </w:r>
-          </w:p>
-        </w:tc>
-      </w:tr>
-      <w:tr>
-        <w:tc>
-          <w:tcPr>
-            <w:tcW w:w="4320" w:type="dxa"/>
-            <w:shd w:val="clear" w:color="auto" w:fill="D9E1F2"/>
-          </w:tcPr>
-          <w:p>
-            <w:pPr>
-              <w:rPr>
-                <w:szCs w:val="28"/>
-              </w:rPr>
-            </w:pPr>
-            <w:proofErr w:type="spellStart"/>
-            <w:r>
-              <w:rPr>
-                <w:b/>
-                <w:color w:val="000000"/>
-                <w:szCs w:val="28"/>
-              </w:rPr>
-              <w:t>Lecciones</w:t>
-            </w:r>
-            <w:proofErr w:type="spellEnd"/>
-            <w:r>
-              <w:rPr>
-                <w:b/>
-                <w:color w:val="000000"/>
-                <w:szCs w:val="28"/>
-              </w:rPr>
-              <w:t xml:space="preserve"> </w:t>
-            </w:r>
-            <w:proofErr w:type="spellStart"/>
-            <w:r>
-              <w:rPr>
-                <w:b/>
-                <w:color w:val="000000"/>
-                <w:szCs w:val="28"/>
-              </w:rPr>
-              <w:t>aprendidas</w:t>
-            </w:r>
-            <w:proofErr w:type="spellEnd"/>
-            <w:r>
-              <w:rPr>
-                <w:b/>
-                <w:color w:val="000000"/>
-                <w:szCs w:val="28"/>
-              </w:rPr>
-              <w:t xml:space="preserve"> clave</w:t>
+              <w:lastRenderedPageBreak/>
+              <w:t>Lecciones aprendidas clave</w:t>
             </w:r>
           </w:p>
         </w:tc>
@@ -3227,19 +3706,9 @@
       <w:pPr>
         <w:pStyle w:val="Ttulo1"/>
       </w:pPr>
-      <w:proofErr w:type="spellStart"/>
       <w:r>
-        <w:t>Glosario</w:t>
+        <w:t>Glosario de Siglas</w:t>
       </w:r>
-      <w:proofErr w:type="spellEnd"/>
-      <w:r>
-        <w:t xml:space="preserve"> de </w:t>
-      </w:r>
-      <w:proofErr w:type="spellStart"/>
-      <w:r>
-        <w:t>Siglas</w:t>
-      </w:r>
-      <w:proofErr w:type="spellEnd"/>
     </w:p>
     <w:tbl>
       <w:tblPr>
@@ -3248,14 +3717,14 @@
         <w:tblLook w:val="04A0" w:firstRow="1" w:lastRow="0" w:firstColumn="1" w:lastColumn="0" w:noHBand="0" w:noVBand="1"/>
       </w:tblPr>
       <w:tblGrid>
-        <w:gridCol w:w="2880"/>
-        <w:gridCol w:w="2880"/>
-        <w:gridCol w:w="2880"/>
+        <w:gridCol w:w="1242"/>
+        <w:gridCol w:w="3686"/>
+        <w:gridCol w:w="3712"/>
       </w:tblGrid>
       <w:tr>
         <w:tc>
           <w:tcPr>
-            <w:tcW w:w="2880" w:type="dxa"/>
+            <w:tcW w:w="1242" w:type="dxa"/>
             <w:shd w:val="clear" w:color="auto" w:fill="1F3864"/>
           </w:tcPr>
           <w:p>
@@ -3276,7 +3745,7 @@
         </w:tc>
         <w:tc>
           <w:tcPr>
-            <w:tcW w:w="2880" w:type="dxa"/>
+            <w:tcW w:w="3686" w:type="dxa"/>
             <w:shd w:val="clear" w:color="auto" w:fill="1F3864"/>
           </w:tcPr>
           <w:p>
@@ -3297,7 +3766,7 @@
         </w:tc>
         <w:tc>
           <w:tcPr>
-            <w:tcW w:w="2880" w:type="dxa"/>
+            <w:tcW w:w="3712" w:type="dxa"/>
             <w:shd w:val="clear" w:color="auto" w:fill="1F3864"/>
           </w:tcPr>
           <w:p>
@@ -3320,7 +3789,7 @@
       <w:tr>
         <w:tc>
           <w:tcPr>
-            <w:tcW w:w="2880" w:type="dxa"/>
+            <w:tcW w:w="1242" w:type="dxa"/>
             <w:shd w:val="clear" w:color="auto" w:fill="D9E1F2"/>
           </w:tcPr>
           <w:p>
@@ -3341,7 +3810,7 @@
         </w:tc>
         <w:tc>
           <w:tcPr>
-            <w:tcW w:w="2880" w:type="dxa"/>
+            <w:tcW w:w="3686" w:type="dxa"/>
             <w:shd w:val="clear" w:color="auto" w:fill="D9E1F2"/>
           </w:tcPr>
           <w:p>
@@ -3361,7 +3830,7 @@
         </w:tc>
         <w:tc>
           <w:tcPr>
-            <w:tcW w:w="2880" w:type="dxa"/>
+            <w:tcW w:w="3712" w:type="dxa"/>
             <w:shd w:val="clear" w:color="auto" w:fill="D9E1F2"/>
           </w:tcPr>
           <w:p>
@@ -3385,7 +3854,7 @@
       <w:tr>
         <w:tc>
           <w:tcPr>
-            <w:tcW w:w="2880" w:type="dxa"/>
+            <w:tcW w:w="1242" w:type="dxa"/>
             <w:shd w:val="clear" w:color="auto" w:fill="FFFFFF"/>
           </w:tcPr>
           <w:p>
@@ -3406,7 +3875,7 @@
         </w:tc>
         <w:tc>
           <w:tcPr>
-            <w:tcW w:w="2880" w:type="dxa"/>
+            <w:tcW w:w="3686" w:type="dxa"/>
             <w:shd w:val="clear" w:color="auto" w:fill="FFFFFF"/>
           </w:tcPr>
           <w:p>
@@ -3426,7 +3895,7 @@
         </w:tc>
         <w:tc>
           <w:tcPr>
-            <w:tcW w:w="2880" w:type="dxa"/>
+            <w:tcW w:w="3712" w:type="dxa"/>
             <w:shd w:val="clear" w:color="auto" w:fill="FFFFFF"/>
           </w:tcPr>
           <w:p>
@@ -3450,7 +3919,7 @@
       <w:tr>
         <w:tc>
           <w:tcPr>
-            <w:tcW w:w="2880" w:type="dxa"/>
+            <w:tcW w:w="1242" w:type="dxa"/>
             <w:shd w:val="clear" w:color="auto" w:fill="D9E1F2"/>
           </w:tcPr>
           <w:p>
@@ -3471,7 +3940,7 @@
         </w:tc>
         <w:tc>
           <w:tcPr>
-            <w:tcW w:w="2880" w:type="dxa"/>
+            <w:tcW w:w="3686" w:type="dxa"/>
             <w:shd w:val="clear" w:color="auto" w:fill="D9E1F2"/>
           </w:tcPr>
           <w:p>
@@ -3491,7 +3960,7 @@
         </w:tc>
         <w:tc>
           <w:tcPr>
-            <w:tcW w:w="2880" w:type="dxa"/>
+            <w:tcW w:w="3712" w:type="dxa"/>
             <w:shd w:val="clear" w:color="auto" w:fill="D9E1F2"/>
           </w:tcPr>
           <w:p>
@@ -3513,7 +3982,7 @@
       <w:tr>
         <w:tc>
           <w:tcPr>
-            <w:tcW w:w="2880" w:type="dxa"/>
+            <w:tcW w:w="1242" w:type="dxa"/>
             <w:shd w:val="clear" w:color="auto" w:fill="FFFFFF"/>
           </w:tcPr>
           <w:p>
@@ -3534,7 +4003,7 @@
         </w:tc>
         <w:tc>
           <w:tcPr>
-            <w:tcW w:w="2880" w:type="dxa"/>
+            <w:tcW w:w="3686" w:type="dxa"/>
             <w:shd w:val="clear" w:color="auto" w:fill="FFFFFF"/>
           </w:tcPr>
           <w:p>
@@ -3554,7 +4023,7 @@
         </w:tc>
         <w:tc>
           <w:tcPr>
-            <w:tcW w:w="2880" w:type="dxa"/>
+            <w:tcW w:w="3712" w:type="dxa"/>
             <w:shd w:val="clear" w:color="auto" w:fill="FFFFFF"/>
           </w:tcPr>
           <w:p>
@@ -3578,7 +4047,7 @@
       <w:tr>
         <w:tc>
           <w:tcPr>
-            <w:tcW w:w="2880" w:type="dxa"/>
+            <w:tcW w:w="1242" w:type="dxa"/>
             <w:shd w:val="clear" w:color="auto" w:fill="D9E1F2"/>
           </w:tcPr>
           <w:p>
@@ -3599,7 +4068,7 @@
         </w:tc>
         <w:tc>
           <w:tcPr>
-            <w:tcW w:w="2880" w:type="dxa"/>
+            <w:tcW w:w="3686" w:type="dxa"/>
             <w:shd w:val="clear" w:color="auto" w:fill="D9E1F2"/>
           </w:tcPr>
           <w:p>
@@ -3619,7 +4088,7 @@
         </w:tc>
         <w:tc>
           <w:tcPr>
-            <w:tcW w:w="2880" w:type="dxa"/>
+            <w:tcW w:w="3712" w:type="dxa"/>
             <w:shd w:val="clear" w:color="auto" w:fill="D9E1F2"/>
           </w:tcPr>
           <w:p>
@@ -3633,15 +4102,7 @@
                 <w:color w:val="000000"/>
                 <w:szCs w:val="28"/>
               </w:rPr>
-              <w:t xml:space="preserve">Iteración de desarrollo </w:t>
-            </w:r>
-            <w:r>
-              <w:rPr>
-                <w:color w:val="000000"/>
-                <w:szCs w:val="28"/>
-              </w:rPr>
-              <w:lastRenderedPageBreak/>
-              <w:t>Scrum</w:t>
+              <w:t>Iteración de desarrollo Scrum</w:t>
             </w:r>
           </w:p>
         </w:tc>
@@ -3649,7 +4110,7 @@
       <w:tr>
         <w:tc>
           <w:tcPr>
-            <w:tcW w:w="2880" w:type="dxa"/>
+            <w:tcW w:w="1242" w:type="dxa"/>
             <w:shd w:val="clear" w:color="auto" w:fill="FFFFFF"/>
           </w:tcPr>
           <w:p>
@@ -3664,14 +4125,13 @@
                 <w:color w:val="000000"/>
                 <w:szCs w:val="28"/>
               </w:rPr>
-              <w:lastRenderedPageBreak/>
               <w:t>RBAC</w:t>
             </w:r>
           </w:p>
         </w:tc>
         <w:tc>
           <w:tcPr>
-            <w:tcW w:w="2880" w:type="dxa"/>
+            <w:tcW w:w="3686" w:type="dxa"/>
             <w:shd w:val="clear" w:color="auto" w:fill="FFFFFF"/>
           </w:tcPr>
           <w:p>
@@ -3691,7 +4151,7 @@
         </w:tc>
         <w:tc>
           <w:tcPr>
-            <w:tcW w:w="2880" w:type="dxa"/>
+            <w:tcW w:w="3712" w:type="dxa"/>
             <w:shd w:val="clear" w:color="auto" w:fill="FFFFFF"/>
           </w:tcPr>
           <w:p>
@@ -3715,7 +4175,7 @@
       <w:tr>
         <w:tc>
           <w:tcPr>
-            <w:tcW w:w="2880" w:type="dxa"/>
+            <w:tcW w:w="1242" w:type="dxa"/>
             <w:shd w:val="clear" w:color="auto" w:fill="D9E1F2"/>
           </w:tcPr>
           <w:p>
@@ -3736,7 +4196,7 @@
         </w:tc>
         <w:tc>
           <w:tcPr>
-            <w:tcW w:w="2880" w:type="dxa"/>
+            <w:tcW w:w="3686" w:type="dxa"/>
             <w:shd w:val="clear" w:color="auto" w:fill="D9E1F2"/>
           </w:tcPr>
           <w:p>
@@ -3756,7 +4216,7 @@
         </w:tc>
         <w:tc>
           <w:tcPr>
-            <w:tcW w:w="2880" w:type="dxa"/>
+            <w:tcW w:w="3712" w:type="dxa"/>
             <w:shd w:val="clear" w:color="auto" w:fill="D9E1F2"/>
           </w:tcPr>
           <w:p>
@@ -3778,7 +4238,7 @@
       <w:tr>
         <w:tc>
           <w:tcPr>
-            <w:tcW w:w="2880" w:type="dxa"/>
+            <w:tcW w:w="1242" w:type="dxa"/>
             <w:shd w:val="clear" w:color="auto" w:fill="FFFFFF"/>
           </w:tcPr>
           <w:p>
@@ -3799,7 +4259,7 @@
         </w:tc>
         <w:tc>
           <w:tcPr>
-            <w:tcW w:w="2880" w:type="dxa"/>
+            <w:tcW w:w="3686" w:type="dxa"/>
             <w:shd w:val="clear" w:color="auto" w:fill="FFFFFF"/>
           </w:tcPr>
           <w:p>
@@ -3819,7 +4279,7 @@
         </w:tc>
         <w:tc>
           <w:tcPr>
-            <w:tcW w:w="2880" w:type="dxa"/>
+            <w:tcW w:w="3712" w:type="dxa"/>
             <w:shd w:val="clear" w:color="auto" w:fill="FFFFFF"/>
           </w:tcPr>
           <w:p>
@@ -3843,7 +4303,7 @@
       <w:tr>
         <w:tc>
           <w:tcPr>
-            <w:tcW w:w="2880" w:type="dxa"/>
+            <w:tcW w:w="1242" w:type="dxa"/>
             <w:shd w:val="clear" w:color="auto" w:fill="D9E1F2"/>
           </w:tcPr>
           <w:p>
@@ -3864,7 +4324,7 @@
         </w:tc>
         <w:tc>
           <w:tcPr>
-            <w:tcW w:w="2880" w:type="dxa"/>
+            <w:tcW w:w="3686" w:type="dxa"/>
             <w:shd w:val="clear" w:color="auto" w:fill="D9E1F2"/>
           </w:tcPr>
           <w:p>
@@ -3884,7 +4344,7 @@
         </w:tc>
         <w:tc>
           <w:tcPr>
-            <w:tcW w:w="2880" w:type="dxa"/>
+            <w:tcW w:w="3712" w:type="dxa"/>
             <w:shd w:val="clear" w:color="auto" w:fill="D9E1F2"/>
           </w:tcPr>
           <w:p>
@@ -3906,7 +4366,7 @@
       <w:tr>
         <w:tc>
           <w:tcPr>
-            <w:tcW w:w="2880" w:type="dxa"/>
+            <w:tcW w:w="1242" w:type="dxa"/>
             <w:shd w:val="clear" w:color="auto" w:fill="FFFFFF"/>
           </w:tcPr>
           <w:p>
@@ -3927,7 +4387,7 @@
         </w:tc>
         <w:tc>
           <w:tcPr>
-            <w:tcW w:w="2880" w:type="dxa"/>
+            <w:tcW w:w="3686" w:type="dxa"/>
             <w:shd w:val="clear" w:color="auto" w:fill="FFFFFF"/>
           </w:tcPr>
           <w:p>
@@ -3947,7 +4407,7 @@
         </w:tc>
         <w:tc>
           <w:tcPr>
-            <w:tcW w:w="2880" w:type="dxa"/>
+            <w:tcW w:w="3712" w:type="dxa"/>
             <w:shd w:val="clear" w:color="auto" w:fill="FFFFFF"/>
           </w:tcPr>
           <w:p>
@@ -3969,7 +4429,7 @@
       <w:tr>
         <w:tc>
           <w:tcPr>
-            <w:tcW w:w="2880" w:type="dxa"/>
+            <w:tcW w:w="1242" w:type="dxa"/>
             <w:shd w:val="clear" w:color="auto" w:fill="D9E1F2"/>
           </w:tcPr>
           <w:p>
@@ -3990,7 +4450,7 @@
         </w:tc>
         <w:tc>
           <w:tcPr>
-            <w:tcW w:w="2880" w:type="dxa"/>
+            <w:tcW w:w="3686" w:type="dxa"/>
             <w:shd w:val="clear" w:color="auto" w:fill="D9E1F2"/>
           </w:tcPr>
           <w:p>
@@ -4010,7 +4470,7 @@
         </w:tc>
         <w:tc>
           <w:tcPr>
-            <w:tcW w:w="2880" w:type="dxa"/>
+            <w:tcW w:w="3712" w:type="dxa"/>
             <w:shd w:val="clear" w:color="auto" w:fill="D9E1F2"/>
           </w:tcPr>
           <w:p>
@@ -4032,7 +4492,7 @@
       <w:tr>
         <w:tc>
           <w:tcPr>
-            <w:tcW w:w="2880" w:type="dxa"/>
+            <w:tcW w:w="1242" w:type="dxa"/>
             <w:shd w:val="clear" w:color="auto" w:fill="FFFFFF"/>
           </w:tcPr>
           <w:p>
@@ -4053,7 +4513,7 @@
         </w:tc>
         <w:tc>
           <w:tcPr>
-            <w:tcW w:w="2880" w:type="dxa"/>
+            <w:tcW w:w="3686" w:type="dxa"/>
             <w:shd w:val="clear" w:color="auto" w:fill="FFFFFF"/>
           </w:tcPr>
           <w:p>
@@ -4073,7 +4533,7 @@
         </w:tc>
         <w:tc>
           <w:tcPr>
-            <w:tcW w:w="2880" w:type="dxa"/>
+            <w:tcW w:w="3712" w:type="dxa"/>
             <w:shd w:val="clear" w:color="auto" w:fill="FFFFFF"/>
           </w:tcPr>
           <w:p>

</xml_diff>